<commit_message>
Integrate verified 2022 phase-2 chain and refresh all six delivery archives
</commit_message>
<xml_diff>
--- a/deliverables/2026-10-16-execution-ready/paper_framework_execution_ready.docx
+++ b/deliverables/2026-10-16-execution-ready/paper_framework_execution_ready.docx
@@ -2,22 +2,22 @@
 <file path=word/document.xml><?xml version="1.0" encoding="utf-8"?>
 <w:document xmlns:w="http://schemas.openxmlformats.org/wordprocessingml/2006/main" xmlns:m="http://schemas.openxmlformats.org/officeDocument/2006/math" xmlns:r="http://schemas.openxmlformats.org/officeDocument/2006/relationships" xmlns:o="urn:schemas-microsoft-com:office:office" xmlns:v="urn:schemas-microsoft-com:vml" xmlns:w10="urn:schemas-microsoft-com:office:word" xmlns:a="http://schemas.openxmlformats.org/drawingml/2006/main" xmlns:pic="http://schemas.openxmlformats.org/drawingml/2006/picture" xmlns:wp="http://schemas.openxmlformats.org/drawingml/2006/wordprocessingDrawing">
   <w:body>
-    <w:bookmarkStart w:id="67" w:name="滴灌玉米改进aquacrop的分阶段校准独立范围敏感性与确定性灌溉优化"/>
+    <w:bookmarkStart w:id="59" w:name="滴灌玉米改进aquacrop的分阶段校准全局范围敏感性与确定性灌溉优化"/>
     <w:p>
       <w:pPr>
         <w:pStyle w:val="Heading1"/>
       </w:pPr>
       <w:r>
-        <w:t xml:space="preserve">滴灌玉米改进AquaCrop的分阶段校准、独立范围敏感性与确定性灌溉优化</w:t>
-      </w:r>
-    </w:p>
-    <w:bookmarkStart w:id="20" w:name="论文框架修订稿2026-10-16执行准备增补版"/>
+        <w:t xml:space="preserve">滴灌玉米改进AquaCrop的分阶段校准、全局范围敏感性与确定性灌溉优化</w:t>
+      </w:r>
+    </w:p>
+    <w:bookmarkStart w:id="20" w:name="论文框架与数据插图更新稿2026-10-17"/>
     <w:p>
       <w:pPr>
         <w:pStyle w:val="Heading2"/>
       </w:pPr>
       <w:r>
-        <w:t xml:space="preserve">论文框架修订稿（2026-10-16，执行准备增补版）</w:t>
+        <w:t xml:space="preserve">论文框架与数据插图更新稿（2026-10-17）</w:t>
       </w:r>
     </w:p>
     <w:p>
@@ -25,7 +25,7 @@
         <w:pStyle w:val="FirstParagraph"/>
       </w:pPr>
       <w:r>
-        <w:t xml:space="preserve">定位：已核验的校准资料与确定性方法框架。正式真实模型Sobol和优化结果尚未生成。条件扰动是补充核验，不声称拥有八维联合后验。</w:t>
+        <w:t xml:space="preserve">本稿已纳入2022真实第二阶段链及精确均值点输出。MCMC作为冻结输入；正式真实模型Sobol、NSGA-III及最终田间管理结论仍待原模型执行，不提前填写指数或节水幅度。</w:t>
       </w:r>
     </w:p>
     <w:bookmarkEnd w:id="20"/>
@@ -43,13 +43,13 @@
         <w:pStyle w:val="FirstParagraph"/>
       </w:pPr>
       <w:r>
-        <w:t xml:space="preserve">本研究整理2019—2022年滴灌玉米气象、冠层、作物及初始土壤水资料，构建分阶段条件校准与确定性灌溉决策框架。2019—2021已有配对输出可重现较好校准拟合；新增中心参数表中29个值与原始链均值吻合，2022阶段二仍待原始检查点交叉核验。后续拟在真实Modified DI模型中，以独立均匀物理范围开展Sobol响应分析，以年度中心参数驱动双目标NSGA-III，加入灌水、产量及过程物理约束，并单列条件参数扰动。当前证据支持样本内校准重现与内部数值一致性；正式敏感性排序、节水幅度和推广结论须在真实模型新运行后报告。</w:t>
-      </w:r>
-      <w:r>
-        <w:t xml:space="preserve"> </w:t>
-      </w:r>
-      <w:r>
-        <w:t xml:space="preserve">关键词：滴灌玉米；改进AquaCrop；条件校准；Sobol；确定性优化。</w:t>
+        <w:t xml:space="preserve">本研究整理2019—2022年DI玉米气象、冠层、生物量、产量与土壤初始水资料，采用分组分阶段校准，并以年度参数中心点构建独立范围敏感性与确定性灌溉决策框架。现有配对资料支持2019—2021样本内校准评价；2022新补真实条件链包含2000步、32个walker，按5τ统一截断后保留58784行三参数样本，所报告均值和分位可由原始数组重建。四年32个中心值均已交叉核验，季节水量账内部闭合。后续拟在冻结Modified DI模型中开展公共独立均匀范围Sobol和受约束双目标NSGA-III，再单列候选的组内条件扰动。当前证据支持校准重现与数值一致性，正式敏感性排序、节水潜力与推广性须由真实模型新运行检验。</w:t>
+      </w:r>
+      <w:r>
+        <w:t xml:space="preserve"> </w:t>
+      </w:r>
+      <w:r>
+        <w:t xml:space="preserve">关键词：亏缺灌溉玉米；改进AquaCrop；分阶段条件校准；Sobol；NSGA-III。</w:t>
       </w:r>
     </w:p>
     <w:bookmarkEnd w:id="21"/>
@@ -67,19 +67,19 @@
         <w:pStyle w:val="FirstParagraph"/>
       </w:pPr>
       <w:r>
-        <w:t xml:space="preserve">问题主线是如何从可解释的过程校准走向受约束、可执行的管理决策。MCMC、Sobol、NSGA-III是工具组合，本身不构成已证实的创新。</w:t>
-      </w:r>
-      <w:r>
-        <w:t xml:space="preserve"> </w:t>
-      </w:r>
-      <w:r>
-        <w:t xml:space="preserve">RQ1：分阶段校准后，模型在已有资料上能重现哪些过程？RQ2：指定独立参数范围内，哪些参数贡献输出方差？RQ3：固定年度中心点时，满足产量与水量约束的制度是什么？补充问题：候选在透明的组内条件扰动下是否稳定？</w:t>
-      </w:r>
-      <w:r>
-        <w:t xml:space="preserve"> </w:t>
-      </w:r>
-      <w:r>
-        <w:t xml:space="preserve">研究区、原始试验和文献来源应补自原始资料，不自行填入坐标、重复次数或试验设计。</w:t>
+        <w:t xml:space="preserve">研究问题是如何把可解释的作物水分过程校准用于受供水和产量限制的灌溉决策。工具组合本身不构成创新；需要明确新的过程认识或可执行决策依据。</w:t>
+      </w:r>
+      <w:r>
+        <w:t xml:space="preserve"> </w:t>
+      </w:r>
+      <w:r>
+        <w:t xml:space="preserve">RQ1：既有资料支持哪些样本内过程重现与参数补偿结论？RQ2：在预声明独立物理范围中，哪些参数贡献输出方差？RQ3：固定年度中心点时，满足水量和观测产量门槛的非支配制度是什么？补充问题是这些候选对分组条件参数扰动是否稳定。</w:t>
+      </w:r>
+      <w:r>
+        <w:t xml:space="preserve"> </w:t>
+      </w:r>
+      <w:r>
+        <w:t xml:space="preserve">研究区坐标、原始田间设计、重复数及测量误差应从原资料补齐，不凭结果图推断试验细节。</w:t>
       </w:r>
     </w:p>
     <w:p>
@@ -89,9 +89,9 @@
       <w:r>
         <w:drawing>
           <wp:inline>
-            <wp:extent cx="5334000" cy="2839391"/>
+            <wp:extent cx="5334000" cy="2955755"/>
             <wp:effectExtent b="0" l="0" r="0" t="0"/>
-            <wp:docPr descr="修订主线：确定性决策，条件扰动单列" title="" id="23" name="Picture"/>
+            <wp:docPr descr="更新后的确定性主线与资料状态" title="" id="23" name="Picture"/>
             <a:graphic>
               <a:graphicData uri="http://schemas.openxmlformats.org/drawingml/2006/picture">
                 <pic:pic>
@@ -110,7 +110,7 @@
                   <pic:spPr bwMode="auto">
                     <a:xfrm>
                       <a:off x="0" y="0"/>
-                      <a:ext cx="5334000" cy="2839391"/>
+                      <a:ext cx="5334000" cy="2955755"/>
                     </a:xfrm>
                     <a:prstGeom prst="rect">
                       <a:avLst/>
@@ -134,7 +134,7 @@
         <w:pStyle w:val="ImageCaption"/>
       </w:pPr>
       <w:r>
-        <w:t xml:space="preserve">修订主线：确定性决策，条件扰动单列</w:t>
+        <w:t xml:space="preserve">更新后的确定性主线与资料状态</w:t>
       </w:r>
     </w:p>
     <w:p>
@@ -142,24 +142,25 @@
         <w:pStyle w:val="BodyText"/>
       </w:pPr>
       <w:r>
-        <w:t xml:space="preserve">图注：不需要伪八维联合后验。独立范围Sobol是响应实验，不是后验归因；正式真实模型的敏感性和优化结果尚未生成。</w:t>
+        <w:t xml:space="preserve">图注：2022正式阶段二链已补齐；真实模型原实现仍缺，未运行正式Sobol/NSGA-III。</w:t>
       </w:r>
     </w:p>
     <w:bookmarkEnd w:id="25"/>
-    <w:bookmarkStart w:id="29" w:name="数据及其证据角色"/>
+    <w:bookmarkStart w:id="29" w:name="数据来源与证据角色"/>
     <w:p>
       <w:pPr>
         <w:pStyle w:val="Heading2"/>
       </w:pPr>
       <w:r>
-        <w:t xml:space="preserve">2 数据及其证据角色</w:t>
+        <w:t xml:space="preserve">2 数据、来源与证据角色</w:t>
       </w:r>
     </w:p>
     <w:tbl>
       <w:tblPr>
         <w:tblStyle w:val="Table"/>
-        <w:tblW w:type="auto" w:w="0"/>
+        <w:tblW w:type="pct" w:w="5000"/>
         <w:jc w:val="left"/>
+        <w:tblLayout w:type="fixed"/>
         <w:tblLook w:firstRow="1" w:lastRow="0" w:firstColumn="0" w:lastColumn="0" w:noHBand="0" w:noVBand="0" w:val="0020"/>
         <w:tblBorders>
           <w:top w:val="single" w:sz="4" w:color="C6D1D9"/>
@@ -209,7 +210,7 @@
               <w:rPr>
                 <w:sz w:val="16"/>
               </w:rPr>
-              <w:t xml:space="preserve">使用角色</w:t>
+              <w:t xml:space="preserve">用途</w:t>
             </w:r>
           </w:p>
         </w:tc>
@@ -226,7 +227,7 @@
               <w:rPr>
                 <w:sz w:val="16"/>
               </w:rPr>
-              <w:t xml:space="preserve">限定</w:t>
+              <w:t xml:space="preserve">范围与限定</w:t>
             </w:r>
           </w:p>
         </w:tc>
@@ -258,22 +259,22 @@
               <w:rPr>
                 <w:sz w:val="16"/>
               </w:rPr>
-              <w:t xml:space="preserve">校准</w:t>
-            </w:r>
-          </w:p>
-        </w:tc>
-        <w:tc>
-          <w:tcPr/>
-          <w:p>
-            <w:pPr>
-              <w:pStyle w:val="Compact"/>
-              <w:jc w:val="left"/>
-            </w:pPr>
-            <w:r>
-              <w:rPr>
-                <w:sz w:val="16"/>
-              </w:rPr>
-              <w:t xml:space="preserve">原论文读图LAI再换算，非本次新增实测</w:t>
+              <w:t xml:space="preserve">阶段一校准</w:t>
+            </w:r>
+          </w:p>
+        </w:tc>
+        <w:tc>
+          <w:tcPr/>
+          <w:p>
+            <w:pPr>
+              <w:pStyle w:val="Compact"/>
+              <w:jc w:val="left"/>
+            </w:pPr>
+            <w:r>
+              <w:rPr>
+                <w:sz w:val="16"/>
+              </w:rPr>
+              <w:t xml:space="preserve">论文数字化LAI再转换，非本次新增田间观测</w:t>
             </w:r>
           </w:p>
         </w:tc>
@@ -305,22 +306,22 @@
               <w:rPr>
                 <w:sz w:val="16"/>
               </w:rPr>
-              <w:t xml:space="preserve">辅助时序</w:t>
-            </w:r>
-          </w:p>
-        </w:tc>
-        <w:tc>
-          <w:tcPr/>
-          <w:p>
-            <w:pPr>
-              <w:pStyle w:val="Compact"/>
-              <w:jc w:val="left"/>
-            </w:pPr>
-            <w:r>
-              <w:rPr>
-                <w:sz w:val="16"/>
-              </w:rPr>
-              <w:t xml:space="preserve">BI或处理未知，不是DI外部验证</w:t>
+              <w:t xml:space="preserve">未进入似然的辅助时序</w:t>
+            </w:r>
+          </w:p>
+        </w:tc>
+        <w:tc>
+          <w:tcPr/>
+          <w:p>
+            <w:pPr>
+              <w:pStyle w:val="Compact"/>
+              <w:jc w:val="left"/>
+            </w:pPr>
+            <w:r>
+              <w:rPr>
+                <w:sz w:val="16"/>
+              </w:rPr>
+              <w:t xml:space="preserve">2019—2021为BI、2022处理标签缺失，不称DI外部验证</w:t>
             </w:r>
           </w:p>
         </w:tc>
@@ -337,37 +338,37 @@
               <w:rPr>
                 <w:sz w:val="16"/>
               </w:rPr>
-              <w:t xml:space="preserve">生物量、年产量</w:t>
-            </w:r>
-          </w:p>
-        </w:tc>
-        <w:tc>
-          <w:tcPr/>
-          <w:p>
-            <w:pPr>
-              <w:pStyle w:val="Compact"/>
-              <w:jc w:val="left"/>
-            </w:pPr>
-            <w:r>
-              <w:rPr>
-                <w:sz w:val="16"/>
-              </w:rPr>
-              <w:t xml:space="preserve">阶段二校准</w:t>
-            </w:r>
-          </w:p>
-        </w:tc>
-        <w:tc>
-          <w:tcPr/>
-          <w:p>
-            <w:pPr>
-              <w:pStyle w:val="Compact"/>
-              <w:jc w:val="left"/>
-            </w:pPr>
-            <w:r>
-              <w:rPr>
-                <w:sz w:val="16"/>
-              </w:rPr>
-              <w:t xml:space="preserve">保留读图误差、sigma假设与含水率</w:t>
+              <w:t xml:space="preserve">Tr与Es</w:t>
+            </w:r>
+          </w:p>
+        </w:tc>
+        <w:tc>
+          <w:tcPr/>
+          <w:p>
+            <w:pPr>
+              <w:pStyle w:val="Compact"/>
+              <w:jc w:val="left"/>
+            </w:pPr>
+            <w:r>
+              <w:rPr>
+                <w:sz w:val="16"/>
+              </w:rPr>
+              <w:t xml:space="preserve">阶段一过程约束</w:t>
+            </w:r>
+          </w:p>
+        </w:tc>
+        <w:tc>
+          <w:tcPr/>
+          <w:p>
+            <w:pPr>
+              <w:pStyle w:val="Compact"/>
+              <w:jc w:val="left"/>
+            </w:pPr>
+            <w:r>
+              <w:rPr>
+                <w:sz w:val="16"/>
+              </w:rPr>
+              <w:t xml:space="preserve">保留Es近似目标和数字化误差限定</w:t>
             </w:r>
           </w:p>
         </w:tc>
@@ -384,37 +385,37 @@
               <w:rPr>
                 <w:sz w:val="16"/>
               </w:rPr>
-              <w:t xml:space="preserve">Tr、Es</w:t>
-            </w:r>
-          </w:p>
-        </w:tc>
-        <w:tc>
-          <w:tcPr/>
-          <w:p>
-            <w:pPr>
-              <w:pStyle w:val="Compact"/>
-              <w:jc w:val="left"/>
-            </w:pPr>
-            <w:r>
-              <w:rPr>
-                <w:sz w:val="16"/>
-              </w:rPr>
-              <w:t xml:space="preserve">过程约束</w:t>
-            </w:r>
-          </w:p>
-        </w:tc>
-        <w:tc>
-          <w:tcPr/>
-          <w:p>
-            <w:pPr>
-              <w:pStyle w:val="Compact"/>
-              <w:jc w:val="left"/>
-            </w:pPr>
-            <w:r>
-              <w:rPr>
-                <w:sz w:val="16"/>
-              </w:rPr>
-              <w:t xml:space="preserve">Es近似；ET不重复作独立似然</w:t>
+              <w:t xml:space="preserve">Biomass与年Yield</w:t>
+            </w:r>
+          </w:p>
+        </w:tc>
+        <w:tc>
+          <w:tcPr/>
+          <w:p>
+            <w:pPr>
+              <w:pStyle w:val="Compact"/>
+              <w:jc w:val="left"/>
+            </w:pPr>
+            <w:r>
+              <w:rPr>
+                <w:sz w:val="16"/>
+              </w:rPr>
+              <w:t xml:space="preserve">阶段二条件校准</w:t>
+            </w:r>
+          </w:p>
+        </w:tc>
+        <w:tc>
+          <w:tcPr/>
+          <w:p>
+            <w:pPr>
+              <w:pStyle w:val="Compact"/>
+              <w:jc w:val="left"/>
+            </w:pPr>
+            <w:r>
+              <w:rPr>
+                <w:sz w:val="16"/>
+              </w:rPr>
+              <w:t xml:space="preserve">生物量与产量不是独立验证；产量为13%含水率</w:t>
             </w:r>
           </w:p>
         </w:tc>
@@ -431,37 +432,37 @@
               <w:rPr>
                 <w:sz w:val="16"/>
               </w:rPr>
-              <w:t xml:space="preserve">初始土壤水</w:t>
-            </w:r>
-          </w:p>
-        </w:tc>
-        <w:tc>
-          <w:tcPr/>
-          <w:p>
-            <w:pPr>
-              <w:pStyle w:val="Compact"/>
-              <w:jc w:val="left"/>
-            </w:pPr>
-            <w:r>
-              <w:rPr>
-                <w:sz w:val="16"/>
-              </w:rPr>
-              <w:t xml:space="preserve">模型输入</w:t>
-            </w:r>
-          </w:p>
-        </w:tc>
-        <w:tc>
-          <w:tcPr/>
-          <w:p>
-            <w:pPr>
-              <w:pStyle w:val="Compact"/>
-              <w:jc w:val="left"/>
-            </w:pPr>
-            <w:r>
-              <w:rPr>
-                <w:sz w:val="16"/>
-              </w:rPr>
-              <w:t xml:space="preserve">分层读图/再分析来源需明示</w:t>
+              <w:t xml:space="preserve">ET</w:t>
+            </w:r>
+          </w:p>
+        </w:tc>
+        <w:tc>
+          <w:tcPr/>
+          <w:p>
+            <w:pPr>
+              <w:pStyle w:val="Compact"/>
+              <w:jc w:val="left"/>
+            </w:pPr>
+            <w:r>
+              <w:rPr>
+                <w:sz w:val="16"/>
+              </w:rPr>
+              <w:t xml:space="preserve">Tr+Es的派生核对</w:t>
+            </w:r>
+          </w:p>
+        </w:tc>
+        <w:tc>
+          <w:tcPr/>
+          <w:p>
+            <w:pPr>
+              <w:pStyle w:val="Compact"/>
+              <w:jc w:val="left"/>
+            </w:pPr>
+            <w:r>
+              <w:rPr>
+                <w:sz w:val="16"/>
+              </w:rPr>
+              <w:t xml:space="preserve">不重复作为独立似然信息计权</w:t>
             </w:r>
           </w:p>
         </w:tc>
@@ -478,37 +479,37 @@
               <w:rPr>
                 <w:sz w:val="16"/>
               </w:rPr>
-              <w:t xml:space="preserve">灌溉日程</w:t>
-            </w:r>
-          </w:p>
-        </w:tc>
-        <w:tc>
-          <w:tcPr/>
-          <w:p>
-            <w:pPr>
-              <w:pStyle w:val="Compact"/>
-              <w:jc w:val="left"/>
-            </w:pPr>
-            <w:r>
-              <w:rPr>
-                <w:sz w:val="16"/>
-              </w:rPr>
-              <w:t xml:space="preserve">模型基准</w:t>
-            </w:r>
-          </w:p>
-        </w:tc>
-        <w:tc>
-          <w:tcPr/>
-          <w:p>
-            <w:pPr>
-              <w:pStyle w:val="Compact"/>
-              <w:jc w:val="left"/>
-            </w:pPr>
-            <w:r>
-              <w:rPr>
-                <w:sz w:val="16"/>
-              </w:rPr>
-              <w:t xml:space="preserve">不能称全部来自真实分次实测</w:t>
+              <w:t xml:space="preserve">气象、土壤与灌溉</w:t>
+            </w:r>
+          </w:p>
+        </w:tc>
+        <w:tc>
+          <w:tcPr/>
+          <w:p>
+            <w:pPr>
+              <w:pStyle w:val="Compact"/>
+              <w:jc w:val="left"/>
+            </w:pPr>
+            <w:r>
+              <w:rPr>
+                <w:sz w:val="16"/>
+              </w:rPr>
+              <w:t xml:space="preserve">模型驱动/管理基准</w:t>
+            </w:r>
+          </w:p>
+        </w:tc>
+        <w:tc>
+          <w:tcPr/>
+          <w:p>
+            <w:pPr>
+              <w:pStyle w:val="Compact"/>
+              <w:jc w:val="left"/>
+            </w:pPr>
+            <w:r>
+              <w:rPr>
+                <w:sz w:val="16"/>
+              </w:rPr>
+              <w:t xml:space="preserve">纠偏、分层初始水和部分假定分次日程均须追溯</w:t>
             </w:r>
           </w:p>
         </w:tc>
@@ -521,9 +522,9 @@
       <w:r>
         <w:drawing>
           <wp:inline>
-            <wp:extent cx="5334000" cy="3389885"/>
+            <wp:extent cx="5334000" cy="3581151"/>
             <wp:effectExtent b="0" l="0" r="0" t="0"/>
-            <wp:docPr descr="CC数据流：校准资料与辅助时序对照" title="" id="27" name="Picture"/>
+            <wp:docPr descr="CC证据角色未改变：校准资料与RS辅助时序" title="" id="27" name="Picture"/>
             <a:graphic>
               <a:graphicData uri="http://schemas.openxmlformats.org/drawingml/2006/picture">
                 <pic:pic>
@@ -542,7 +543,7 @@
                   <pic:spPr bwMode="auto">
                     <a:xfrm>
                       <a:off x="0" y="0"/>
-                      <a:ext cx="5334000" cy="3389885"/>
+                      <a:ext cx="5334000" cy="3581151"/>
                     </a:xfrm>
                     <a:prstGeom prst="rect">
                       <a:avLst/>
@@ -566,7 +567,7 @@
         <w:pStyle w:val="ImageCaption"/>
       </w:pPr>
       <w:r>
-        <w:t xml:space="preserve">CC数据流：校准资料与辅助时序对照</w:t>
+        <w:t xml:space="preserve">CC证据角色未改变：校准资料与RS辅助时序</w:t>
       </w:r>
     </w:p>
     <w:p>
@@ -574,26 +575,17 @@
         <w:pStyle w:val="BodyText"/>
       </w:pPr>
       <w:r>
-        <w:t xml:space="preserve">图注：RS CCquad从百分数换为0—1。处理不同/未知，只并列展示，不计算DI外部验证R²；来源均为已提供资料，不是本次新增田间观测。</w:t>
+        <w:t xml:space="preserve">图注：RS不进入似然，但处理不同/未知，不是DI外部独立验证。2022补阶段二不会改变这项数据边界。</w:t>
       </w:r>
     </w:p>
     <w:bookmarkEnd w:id="29"/>
-    <w:bookmarkStart w:id="39" w:name="模型与分阶段条件校准"/>
+    <w:bookmarkStart w:id="33" w:name="冻结模型与年度中心点"/>
     <w:p>
       <w:pPr>
         <w:pStyle w:val="Heading2"/>
       </w:pPr>
       <w:r>
-        <w:t xml:space="preserve">3 模型与分阶段条件校准</w:t>
-      </w:r>
-    </w:p>
-    <w:bookmarkStart w:id="33" w:name="冻结真实modified-di实现"/>
-    <w:p>
-      <w:pPr>
-        <w:pStyle w:val="Heading3"/>
-      </w:pPr>
-      <w:r>
-        <w:t xml:space="preserve">3.1 冻结真实Modified DI实现</w:t>
+        <w:t xml:space="preserve">3 冻结模型与年度中心点</w:t>
       </w:r>
     </w:p>
     <w:p>
@@ -601,31 +593,13 @@
         <w:pStyle w:val="FirstParagraph"/>
       </w:pPr>
       <w:r>
-        <w:t xml:space="preserve">区分标准AquaCrop与actual CC蒸发输入、真实MulchPct、两阶段WP和年度HI0的改进实现。正式适配器需返回Y13、B、Tr、Es、ET、灌溉量及逐日/季节水量残差；缺源码时不能声称已调用成功。</w:t>
-      </w:r>
-      <w:r>
-        <w:t xml:space="preserve"> </w:t>
-      </w:r>
-      <w:r>
-        <w:t xml:space="preserve">建议以标准模型、只改蒸发、只改两阶段WP、两处均改为结构消融对照，使用同一数据划分和预算；此比较尚未执行。样本内R²升高不能单独证明结构优越。</w:t>
-      </w:r>
-      <w:r>
-        <w:t xml:space="preserve"> </w:t>
-      </w:r>
-      <w:r>
-        <w:t xml:space="preserve">### 3.2 参数组与年度中心点</w:t>
-      </w:r>
-      <w:r>
-        <w:t xml:space="preserve"> </w:t>
-      </w:r>
-      <w:r>
-        <w:t xml:space="preserve">阶段一θ1=(CCx,CGC_CD,CDC_CD,SenescenceCD,Kcb)，阶段二θ2=(WP_early,WP_late,HI0)条件于阶段一代表点。两组均值拼成中心点是确定性输入，不是八维联合后验抽样。</w:t>
-      </w:r>
-      <w:r>
-        <w:t xml:space="preserve"> </w:t>
-      </w:r>
-      <w:r>
-        <w:t xml:space="preserve">表1 年度中心点。2022阶段二三个值仍为新报告值；原链待核。</w:t>
+        <w:t xml:space="preserve">真实Modified DI保留actual CC蒸发、真实MulchPct、两阶段WP和年度HI0。原实现在当前材料中仍缺；新的一键脚本通过外部原项目加载模型，不能独立替代原源码。先对齐原基准点和随机管理点，再开展正式敏感性及优化。</w:t>
+      </w:r>
+      <w:r>
+        <w:t xml:space="preserve"> </w:t>
+      </w:r>
+      <w:r>
+        <w:t xml:space="preserve">阶段一θ1=(CCx,CGC_CD,CDC_CD,SenescenceCD,Kcb)，阶段二θ2=(WP_early,WP_late,HI0)条件于阶段一均值。两组均值拼接是确定性中心输入，不是八维联合后验样本。</w:t>
       </w:r>
       <w:r>
         <w:t xml:space="preserve"> </w:t>
@@ -671,9 +645,9 @@
       <w:r>
         <w:drawing>
           <wp:inline>
-            <wp:extent cx="5334000" cy="2909907"/>
+            <wp:extent cx="5334000" cy="2911495"/>
             <wp:effectExtent b="0" l="0" r="0" t="0"/>
-            <wp:docPr descr="年度中心参数：确定性下游输入，不是联合后验样本" title="" id="31" name="Picture"/>
+            <wp:docPr descr="32个年度中心值：两阶段保留均值均已交叉核验" title="" id="31" name="Picture"/>
             <a:graphic>
               <a:graphicData uri="http://schemas.openxmlformats.org/drawingml/2006/picture">
                 <pic:pic>
@@ -692,7 +666,7 @@
                   <pic:spPr bwMode="auto">
                     <a:xfrm>
                       <a:off x="0" y="0"/>
-                      <a:ext cx="5334000" cy="2909907"/>
+                      <a:ext cx="5334000" cy="2911495"/>
                     </a:xfrm>
                     <a:prstGeom prst="rect">
                       <a:avLst/>
@@ -716,7 +690,7 @@
         <w:pStyle w:val="ImageCaption"/>
       </w:pPr>
       <w:r>
-        <w:t xml:space="preserve">年度中心参数：确定性下游输入，不是联合后验样本</w:t>
+        <w:t xml:space="preserve">32个年度中心值：两阶段保留均值均已交叉核验</w:t>
       </w:r>
     </w:p>
     <w:p>
@@ -724,17 +698,93 @@
         <w:pStyle w:val="BodyText"/>
       </w:pPr>
       <w:r>
-        <w:t xml:space="preserve">图注：29个值与原检查点均值一致。2022阶段二3个空心点仅来自新增报告；连线只是年度比较，不作趋势推断。</w:t>
+        <w:t xml:space="preserve">图注：中心点数值未因本次补件改变。2022三个阶段二参数从“文档报告值”升级为“原检查点已核验”；连线只作年度比较。</w:t>
+      </w:r>
+    </w:p>
+    <w:p>
+      <w:pPr>
+        <w:pStyle w:val="BodyText"/>
+      </w:pPr>
+      <w:r>
+        <w:t xml:space="preserve">四年第一阶段各4独立ensemble，阶段二各1个。每组32 walkers、2000步，burn=ceil(5×整组最大τ)，同组参数共用整数截断。</w:t>
+      </w:r>
+      <w:r>
+        <w:t xml:space="preserve"> </w:t>
+      </w:r>
+      <w:r>
+        <w:t xml:space="preserve">| 年份 | 阶段 | burn-in | 每walker保留步数 | 相关样本行数 |</w:t>
+      </w:r>
+      <w:r>
+        <w:t xml:space="preserve"> </w:t>
+      </w:r>
+      <w:r>
+        <w:t xml:space="preserve">| — | — | — | — | — |</w:t>
+      </w:r>
+      <w:r>
+        <w:t xml:space="preserve"> </w:t>
+      </w:r>
+      <w:r>
+        <w:t xml:space="preserve">| 2019 | 1 | 395 | 1605 | 205440 |</w:t>
+      </w:r>
+      <w:r>
+        <w:t xml:space="preserve"> </w:t>
+      </w:r>
+      <w:r>
+        <w:t xml:space="preserve">| 2019 | 2 | 173 | 1827 | 58464 |</w:t>
+      </w:r>
+      <w:r>
+        <w:t xml:space="preserve"> </w:t>
+      </w:r>
+      <w:r>
+        <w:t xml:space="preserve">| 2020 | 1 | 369 | 1631 | 208768 |</w:t>
+      </w:r>
+      <w:r>
+        <w:t xml:space="preserve"> </w:t>
+      </w:r>
+      <w:r>
+        <w:t xml:space="preserve">| 2020 | 2 | 262 | 1738 | 55616 |</w:t>
+      </w:r>
+      <w:r>
+        <w:t xml:space="preserve"> </w:t>
+      </w:r>
+      <w:r>
+        <w:t xml:space="preserve">| 2021 | 1 | 347 | 1653 | 211584 |</w:t>
+      </w:r>
+      <w:r>
+        <w:t xml:space="preserve"> </w:t>
+      </w:r>
+      <w:r>
+        <w:t xml:space="preserve">| 2021 | 2 | 239 | 1761 | 56352 |</w:t>
+      </w:r>
+      <w:r>
+        <w:t xml:space="preserve"> </w:t>
+      </w:r>
+      <w:r>
+        <w:t xml:space="preserve">| 2022 | 1 | 317 | 1683 | 215424 |</w:t>
+      </w:r>
+      <w:r>
+        <w:t xml:space="preserve"> </w:t>
+      </w:r>
+      <w:r>
+        <w:t xml:space="preserve">| 2022 | 2 | 163 | 1837 | 58784 |</w:t>
+      </w:r>
+    </w:p>
+    <w:p>
+      <w:pPr>
+        <w:pStyle w:val="BodyText"/>
+      </w:pPr>
+      <w:r>
+        <w:t xml:space="preserve">2022阶段二均值及区间现已由正式原链核验。源状态为SAMPLING_COMPLETE_REVIEW_REQUIRED；操作性完成不等于已认证严格收敛。原严格Rhat/ESS限制保留为补充诊断，不把耦合walker当独立链，也不为确定性下游流程新增联合后验要求。</w:t>
       </w:r>
     </w:p>
     <w:bookmarkEnd w:id="33"/>
-    <w:bookmarkStart w:id="37" w:name="操作记录与诊断"/>
-    <w:p>
-      <w:pPr>
-        <w:pStyle w:val="Heading3"/>
-      </w:pPr>
-      <w:r>
-        <w:t xml:space="preserve">3.3 操作记录与诊断</w:t>
+    <w:bookmarkStart w:id="34" w:name="sobol公共全局范围的真实模型响应实验"/>
+    <w:p>
+      <w:pPr>
+        <w:pStyle w:val="Heading2"/>
+      </w:pPr>
+      <w:r>
+        <w:t xml:space="preserve">4 Sobol：公共全局范围的真实模型响应实验</w:t>
       </w:r>
     </w:p>
     <w:p>
@@ -742,75 +792,158 @@
         <w:pStyle w:val="FirstParagraph"/>
       </w:pPr>
       <w:r>
-        <w:t xml:space="preserve">每组32 walkers、2000步；第一阶段4个独立ensemble，第二阶段1个。统一burn=ceil(5×整组最大tau)，所有参数共用整数截断。保留draw数仍含相关性。</w:t>
-      </w:r>
-      <w:r>
-        <w:t xml:space="preserve"> </w:t>
-      </w:r>
-      <w:r>
-        <w:t xml:space="preserve">| 年份 | 阶段 | 整组burn-in | 每walker保留步数 | 相关draw数 | 原链可核验 |</w:t>
-      </w:r>
-      <w:r>
-        <w:t xml:space="preserve"> </w:t>
-      </w:r>
-      <w:r>
-        <w:t xml:space="preserve">| — | — | — | — | — | — |</w:t>
-      </w:r>
-      <w:r>
-        <w:t xml:space="preserve"> </w:t>
-      </w:r>
-      <w:r>
-        <w:t xml:space="preserve">| 2019 | 1 | 395 | 1605 | 205440 | True |</w:t>
-      </w:r>
-      <w:r>
-        <w:t xml:space="preserve"> </w:t>
-      </w:r>
-      <w:r>
-        <w:t xml:space="preserve">| 2019 | 2 | 173 | 1827 | 58464 | True |</w:t>
-      </w:r>
-      <w:r>
-        <w:t xml:space="preserve"> </w:t>
-      </w:r>
-      <w:r>
-        <w:t xml:space="preserve">| 2020 | 1 | 369 | 1631 | 208768 | True |</w:t>
-      </w:r>
-      <w:r>
-        <w:t xml:space="preserve"> </w:t>
-      </w:r>
-      <w:r>
-        <w:t xml:space="preserve">| 2020 | 2 | 262 | 1738 | 55616 | True |</w:t>
-      </w:r>
-      <w:r>
-        <w:t xml:space="preserve"> </w:t>
-      </w:r>
-      <w:r>
-        <w:t xml:space="preserve">| 2021 | 1 | 347 | 1653 | 211584 | True |</w:t>
-      </w:r>
-      <w:r>
-        <w:t xml:space="preserve"> </w:t>
-      </w:r>
-      <w:r>
-        <w:t xml:space="preserve">| 2021 | 2 | 239 | 1761 | 56352 | True |</w:t>
-      </w:r>
-      <w:r>
-        <w:t xml:space="preserve"> </w:t>
-      </w:r>
-      <w:r>
-        <w:t xml:space="preserve">| 2022 | 1 | 317 | 1683 | 215424 | True |</w:t>
-      </w:r>
-      <w:r>
-        <w:t xml:space="preserve"> </w:t>
-      </w:r>
-      <w:r>
-        <w:t xml:space="preserve">| 2022 | 2 | 163 | 1837 | 58784 | False |</w:t>
-      </w:r>
-    </w:p>
-    <w:p>
-      <w:pPr>
-        <w:pStyle w:val="BodyText"/>
-      </w:pPr>
-      <w:r>
-        <w:t xml:space="preserve">可以将研究限定为中心点确定性分析，无须宣称联合后验；仍应保留Rhat、ESS、tau估计及参数边界说明。5tau只是截断规则，不是独立的收敛证明。参考PDF尚未上传，当前不宣称已逐条核对其原文。</w:t>
+        <w:t xml:space="preserve">主分析采用公共预声明物理范围内相互独立的均匀分布。该设计回答指定范围下的方差贡献，既不是原MCMC先验密度，也不是条件后验传播；不同年度链支持只作参数结果解释，不自动替换主分析空间。</w:t>
+      </w:r>
+      <w:r>
+        <w:t xml:space="preserve"> </w:t>
+      </w:r>
+      <w:r>
+        <w:t xml:space="preserve">| 参数 | 全局公共范围 | 说明 |</w:t>
+      </w:r>
+      <w:r>
+        <w:t xml:space="preserve"> </w:t>
+      </w:r>
+      <w:r>
+        <w:t xml:space="preserve">| — | — | — |</w:t>
+      </w:r>
+      <w:r>
+        <w:t xml:space="preserve"> </w:t>
+      </w:r>
+      <w:r>
+        <w:t xml:space="preserve">| CCx | 0.60—0.99 | 冠层上限 |</w:t>
+      </w:r>
+      <w:r>
+        <w:t xml:space="preserve"> </w:t>
+      </w:r>
+      <w:r>
+        <w:t xml:space="preserve">| CGC_CD | 0.08—0.16 | 日历日增长参数 |</w:t>
+      </w:r>
+      <w:r>
+        <w:t xml:space="preserve"> </w:t>
+      </w:r>
+      <w:r>
+        <w:t xml:space="preserve">| CDC_CD | 0.03—0.12 | 日历日衰减参数 |</w:t>
+      </w:r>
+      <w:r>
+        <w:t xml:space="preserve"> </w:t>
+      </w:r>
+      <w:r>
+        <w:t xml:space="preserve">| SenescenceCD | 115—145 | 衰老时序 |</w:t>
+      </w:r>
+      <w:r>
+        <w:t xml:space="preserve"> </w:t>
+      </w:r>
+      <w:r>
+        <w:t xml:space="preserve">| Kcb | 1.05—1.60 | 基础作物系数 |</w:t>
+      </w:r>
+      <w:r>
+        <w:t xml:space="preserve"> </w:t>
+      </w:r>
+      <w:r>
+        <w:t xml:space="preserve">| WP_early | 10—40 | 模型定义的前期归一化水分生产力 |</w:t>
+      </w:r>
+      <w:r>
+        <w:t xml:space="preserve"> </w:t>
+      </w:r>
+      <w:r>
+        <w:t xml:space="preserve">| WP_late | 10—40 | 模型定义的后期归一化水分生产力 |</w:t>
+      </w:r>
+      <w:r>
+        <w:t xml:space="preserve"> </w:t>
+      </w:r>
+      <w:r>
+        <w:t xml:space="preserve">| HI0 | 0.35—0.60 | 参考收获指数 |</w:t>
+      </w:r>
+      <w:r>
+        <w:t xml:space="preserve"> </w:t>
+      </w:r>
+      <w:r>
+        <w:t xml:space="preserve">范围沿用指导文件及既有工程的公共物理范围，投稿时仍需补农艺/文献依据。local95采用各年度真实保留样本的2.5%—97.5%边际范围，现2022也可读取，但仅叫邻域响应，不叫后验Sobol，不计算CAI。</w:t>
+      </w:r>
+      <w:r>
+        <w:t xml:space="preserve"> </w:t>
+      </w:r>
+      <w:r>
+        <w:t xml:space="preserve">先N=128、种子101/202/303，不算二阶时每年每种子N(D+2)=1280次；四年共15360次。若排名或区间不稳则升N=512，共61440次完整设计调用。六输出为Y13、Biomass、Tr、Es、ET、MaxCC。</w:t>
+      </w:r>
+      <w:r>
+        <w:t xml:space="preserve"> </w:t>
+      </w:r>
+      <w:r>
+        <w:t xml:space="preserve">主报告ST，同时报告S1、ST−S1、bootstrap区间、均值、方差、单位及Var(Y)×ST。不裁剪估计、不强制Kcb第一；常量输出标为归一化指数未定义。逐年比较，只有方向和区间足以支持时才称跨年稳健关键参数。</w:t>
+      </w:r>
+      <w:r>
+        <w:t xml:space="preserve"> </w:t>
+      </w:r>
+      <w:r>
+        <w:t xml:space="preserve">保存输入空间、哈希、种子、矩阵、每点响应、失败与状态；失败点不能删行或填零。</w:t>
+      </w:r>
+      <w:r>
+        <w:rPr>
+          <w:b/>
+          <w:bCs/>
+        </w:rPr>
+        <w:t xml:space="preserve">正式真实模型的指数及排名尚未计算，不从历史代理图填入。</w:t>
+      </w:r>
+    </w:p>
+    <w:bookmarkEnd w:id="34"/>
+    <w:bookmarkStart w:id="38" w:name="确定性双目标优化与候选条件核验"/>
+    <w:p>
+      <w:pPr>
+        <w:pStyle w:val="Heading2"/>
+      </w:pPr>
+      <w:r>
+        <w:t xml:space="preserve">5 确定性双目标优化与候选条件核验</w:t>
+      </w:r>
+    </w:p>
+    <w:p>
+      <w:pPr>
+        <w:pStyle w:val="FirstParagraph"/>
+      </w:pPr>
+      <w:r>
+        <w:t xml:space="preserve">固定年度中心参数，min(-Y13,I)。优先真实模块的SMT1—SMT4、0—100%，核对百分比定义、根区、触发方向和窗口；不支持时采用4—5阶段水量与明确日期，两种体系不混合解释。</w:t>
+      </w:r>
+      <w:r>
+        <w:t xml:space="preserve"> </w:t>
+      </w:r>
+      <w:r>
+        <w:t xml:space="preserve">硬约束为I≤年度DI基准、Y13≥0.95×文献观测产量；同步报告相对同模型基准变化，检查非负水量、事件日期和完整水量账。IWP=100Y[t/ha]/I[mm]，单位kg/m³。</w:t>
+      </w:r>
+      <w:r>
+        <w:t xml:space="preserve"> </w:t>
+      </w:r>
+      <w:r>
+        <w:t xml:space="preserve">| 年份 | 文献观测 | 模型基准 | 95%绝对门槛 | 可减产余量_pct |</w:t>
+      </w:r>
+      <w:r>
+        <w:t xml:space="preserve"> </w:t>
+      </w:r>
+      <w:r>
+        <w:t xml:space="preserve">| — | — | — | — | — |</w:t>
+      </w:r>
+      <w:r>
+        <w:t xml:space="preserve"> </w:t>
+      </w:r>
+      <w:r>
+        <w:t xml:space="preserve">| 2019 | 16.5500 | 16.7017 | 15.7225 | 5.8628 |</w:t>
+      </w:r>
+      <w:r>
+        <w:t xml:space="preserve"> </w:t>
+      </w:r>
+      <w:r>
+        <w:t xml:space="preserve">| 2020 | 17.2900 | 16.8040 | 16.4255 | 2.2527 |</w:t>
+      </w:r>
+      <w:r>
+        <w:t xml:space="preserve"> </w:t>
+      </w:r>
+      <w:r>
+        <w:t xml:space="preserve">| 2021 | 15.8600 | 15.1971 | 15.0670 | 0.8563 |</w:t>
+      </w:r>
+      <w:r>
+        <w:t xml:space="preserve"> </w:t>
+      </w:r>
+      <w:r>
+        <w:t xml:space="preserve">| 2022 | 14.0800 | 14.0778 | 13.3760 | 4.9850 |</w:t>
       </w:r>
     </w:p>
     <w:p>
@@ -820,20 +953,20 @@
       <w:r>
         <w:drawing>
           <wp:inline>
-            <wp:extent cx="5334000" cy="2388855"/>
+            <wp:extent cx="5334000" cy="2517543"/>
             <wp:effectExtent b="0" l="0" r="0" t="0"/>
-            <wp:docPr descr="采样记录：操作性完成不等于收敛认证" title="" id="35" name="Picture"/>
+            <wp:docPr descr="四年保产门槛余量：2022基准现已可核算" title="" id="36" name="Picture"/>
             <a:graphic>
               <a:graphicData uri="http://schemas.openxmlformats.org/drawingml/2006/picture">
                 <pic:pic>
                   <pic:nvPicPr>
-                    <pic:cNvPr descr="figures/U02_sampling_record.png" id="36" name="Picture"/>
+                    <pic:cNvPr descr="figures/E02_yield_gate_headroom.png" id="37" name="Picture"/>
                     <pic:cNvPicPr>
                       <a:picLocks noChangeArrowheads="1" noChangeAspect="1"/>
                     </pic:cNvPicPr>
                   </pic:nvPicPr>
                   <pic:blipFill>
-                    <a:blip r:embed="rId34"/>
+                    <a:blip r:embed="rId35"/>
                     <a:stretch>
                       <a:fillRect/>
                     </a:stretch>
@@ -841,7 +974,7 @@
                   <pic:spPr bwMode="auto">
                     <a:xfrm>
                       <a:off x="0" y="0"/>
-                      <a:ext cx="5334000" cy="2388855"/>
+                      <a:ext cx="5334000" cy="2517543"/>
                     </a:xfrm>
                     <a:prstGeom prst="rect">
                       <a:avLst/>
@@ -865,7 +998,7 @@
         <w:pStyle w:val="ImageCaption"/>
       </w:pPr>
       <w:r>
-        <w:t xml:space="preserve">采样记录：操作性完成不等于收敛认证</w:t>
+        <w:t xml:space="preserve">四年保产门槛余量：2022基准现已可核算</w:t>
       </w:r>
     </w:p>
     <w:p>
@@ -873,143 +1006,729 @@
         <w:pStyle w:val="BodyText"/>
       </w:pPr>
       <w:r>
-        <w:t xml:space="preserve">图注：阶段一各4独立ensemble，阶段二各1个。斜线/空心是2022阶段二报告值，未经原始链核验。5τ是截断规则；相关draw数不等于独立ESS。</w:t>
-      </w:r>
-    </w:p>
-    <w:bookmarkEnd w:id="37"/>
-    <w:bookmarkStart w:id="38" w:name="校准评价"/>
-    <w:p>
-      <w:pPr>
-        <w:pStyle w:val="Heading3"/>
-      </w:pPr>
-      <w:r>
-        <w:t xml:space="preserve">3.4 校准评价</w:t>
-      </w:r>
-    </w:p>
-    <w:p>
-      <w:pPr>
-        <w:pStyle w:val="FirstParagraph"/>
-      </w:pPr>
-      <w:r>
-        <w:t xml:space="preserve">R²=1−SSE/SST；RMSE为均方误差平方根，Bias=mean(模拟−观测)。一年一对产量只报偏差。以同一批资料评价称校准拟合；不冒充外部验证。</w:t>
-      </w:r>
-    </w:p>
-    <w:bookmarkEnd w:id="38"/>
-    <w:bookmarkEnd w:id="39"/>
-    <w:bookmarkStart w:id="45" w:name="独立范围sobol的正式实施方案"/>
-    <w:p>
-      <w:pPr>
-        <w:pStyle w:val="Heading2"/>
-      </w:pPr>
-      <w:r>
-        <w:t xml:space="preserve">4 独立范围Sobol的正式实施方案</w:t>
-      </w:r>
-    </w:p>
-    <w:p>
-      <w:pPr>
-        <w:pStyle w:val="FirstParagraph"/>
-      </w:pPr>
-      <w:r>
-        <w:t xml:space="preserve">主分析用8参数独立均匀物理范围，回答预声明空间的响应方差贡献，不是相关后验归因；全均匀试验也不等于原贝叶斯先验密度。物理范围需有文献或农艺来源，局部95%边际范围仅叫后验邻域响应实验。</w:t>
-      </w:r>
-      <w:r>
-        <w:t xml:space="preserve"> </w:t>
-      </w:r>
-      <w:r>
-        <w:t xml:space="preserve">先N128×3个scramble，必要时升512。不算二阶时调用数N(D+2)=10N；算二阶为18N。四年N128三种子共15360次真实调用，先计时再定预算。</w:t>
-      </w:r>
-      <w:r>
-        <w:t xml:space="preserve"> </w:t>
-      </w:r>
-      <w:r>
-        <w:t xml:space="preserve">保存输入空间、设计矩阵、逐次响应、S1/ST和bootstrap区间、输出均值方差与单位、失败点和种子。按年度比较排序，不用跨年均值代替年度结果，也不靠裁剪指数或强制排序美化结果。</w:t>
-      </w:r>
-      <w:r>
-        <w:t xml:space="preserve"> </w:t>
+        <w:t xml:space="preserve">图注：2022真实均值点产量14.077783 t/ha；允许减产约4.985%。2021仍仅约0.856%。这些是产量空间余量，不是节水率或置信区间。</w:t>
+      </w:r>
+    </w:p>
+    <w:p>
+      <w:pPr>
+        <w:pStyle w:val="BodyText"/>
+      </w:pPr>
+      <w:r>
+        <w:t xml:space="preserve">2021的模型基准已低估观测约4.18%，因此继续相对模型基准再容许5%减产会放宽真实门槛。2022新精确基准距门槛余量约4.985%，这不是节水率。</w:t>
+      </w:r>
+      <w:r>
+        <w:t xml:space="preserve"> </w:t>
+      </w:r>
+      <w:r>
+        <w:t xml:space="preserve">NSGA-III采用100个双目标参考方向/种群、100代、5算法种子；默认与同预算NSGA-II比较，按年固定HV参考尺度。保存每代X/F/G/CV、目标、约束和前沿，不因结果不理想而只保留单次运行。</w:t>
+      </w:r>
+      <w:r>
+        <w:t xml:space="preserve"> </w:t>
+      </w:r>
+      <w:r>
+        <w:t xml:space="preserve">推荐为ε门槛内最低灌水量，并列两个相邻可行备选；无可行解则明确无推荐，不回退最高产量。最终候选必须以同一真实模型回代，不能用绘图插值得到新可行点。</w:t>
+      </w:r>
+      <w:r>
+        <w:t xml:space="preserve"> </w:t>
+      </w:r>
+      <w:r>
+        <w:t xml:space="preserve">候选分别扰动阶段一/固定阶段二中心、扰动阶段二整行样本/固定阶段一中心，每个可用组至少128行，保留组内相关；2022两个组现均有真实样本。报告均值、5%分位、绝对观测门槛概率、MC误差、灌水/通量/守恒。这是声明分布下的条件核验，不是八维联合传播或田间失收概率。</w:t>
+      </w:r>
+      <w:r>
+        <w:t xml:space="preserve"> </w:t>
+      </w:r>
+      <w:r>
+        <w:t xml:space="preserve">年度专用方案可逐年优化；若要声称未知年通用制度，需留一年/嵌套检验，不用同四年同时选解和验证。</w:t>
       </w:r>
       <w:r>
         <w:rPr>
           <w:b/>
           <w:bCs/>
         </w:rPr>
-        <w:t xml:space="preserve">结果占位：真实模型尚未执行，暂不填写敏感性指数和正式排名，不沿用旧代理图代替。</w:t>
-      </w:r>
-    </w:p>
-    <w:bookmarkStart w:id="43" w:name="年度范围与输入概率密度"/>
+        <w:t xml:space="preserve">真实前沿、节水率和推荐日程尚未生成；旧2021约38%仍撤回。</w:t>
+      </w:r>
+    </w:p>
+    <w:bookmarkEnd w:id="38"/>
+    <w:bookmarkStart w:id="56" w:name="现阶段可写入论文的结果"/>
+    <w:p>
+      <w:pPr>
+        <w:pStyle w:val="Heading2"/>
+      </w:pPr>
+      <w:r>
+        <w:t xml:space="preserve">6 现阶段可写入论文的结果</w:t>
+      </w:r>
+    </w:p>
+    <w:bookmarkStart w:id="42" w:name="校准指标与证据分层"/>
     <w:p>
       <w:pPr>
         <w:pStyle w:val="Heading3"/>
       </w:pPr>
       <w:r>
-        <w:t xml:space="preserve">4.1 年度范围与输入概率密度</w:t>
-      </w:r>
-    </w:p>
-    <w:p>
-      <w:pPr>
-        <w:pStyle w:val="FirstParagraph"/>
-      </w:pPr>
-      <w:r>
-        <w:t xml:space="preserve">本轮从原始NPZ的contract.priors提取支持范围，各年度现有检查点之间一致。它们是历史校准的支持范围，农艺适用性仍需由来源解释，不因为写在代码里就自动成为物理定律。</w:t>
-      </w:r>
-      <w:r>
-        <w:t xml:space="preserve"> </w:t>
-      </w:r>
-      <w:r>
-        <w:t xml:space="preserve">| 参数 | 2019—2021范围 | 2022范围 |</w:t>
-      </w:r>
-      <w:r>
-        <w:t xml:space="preserve"> </w:t>
-      </w:r>
-      <w:r>
-        <w:t xml:space="preserve">| — | — | — |</w:t>
-      </w:r>
-      <w:r>
-        <w:t xml:space="preserve"> </w:t>
-      </w:r>
-      <w:r>
-        <w:t xml:space="preserve">| CCx | [0.6, 0.99] | [0.6, 0.99] |</w:t>
-      </w:r>
-      <w:r>
-        <w:t xml:space="preserve"> </w:t>
-      </w:r>
-      <w:r>
-        <w:t xml:space="preserve">| CGC_CD | [0.08, 0.16] | [0.08, 0.16] |</w:t>
-      </w:r>
-      <w:r>
-        <w:t xml:space="preserve"> </w:t>
-      </w:r>
-      <w:r>
-        <w:t xml:space="preserve">| CDC_CD | [0.03, 0.12] | [0.03, 0.12] |</w:t>
-      </w:r>
-      <w:r>
-        <w:t xml:space="preserve"> </w:t>
-      </w:r>
-      <w:r>
-        <w:t xml:space="preserve">| SenescenceCD | [115, 145] | [115, 145] |</w:t>
-      </w:r>
-      <w:r>
-        <w:t xml:space="preserve"> </w:t>
-      </w:r>
-      <w:r>
-        <w:t xml:space="preserve">| Kcb | [1.05, 1.6] | [1.05, 1.6] |</w:t>
-      </w:r>
-      <w:r>
-        <w:t xml:space="preserve"> </w:t>
-      </w:r>
-      <w:r>
-        <w:t xml:space="preserve">| WP_early | [10, 40] | [10, 22] |</w:t>
-      </w:r>
-      <w:r>
-        <w:t xml:space="preserve"> </w:t>
-      </w:r>
-      <w:r>
-        <w:t xml:space="preserve">| WP_late | [10, 40] | [20, 38] |</w:t>
-      </w:r>
-      <w:r>
-        <w:t xml:space="preserve"> </w:t>
-      </w:r>
-      <w:r>
-        <w:t xml:space="preserve">| HI0 | [0.35, 0.6] | [0.35, 0.5] |</w:t>
+        <w:t xml:space="preserve">6.1 校准指标与证据分层</w:t>
+      </w:r>
+    </w:p>
+    <w:tbl>
+      <w:tblPr>
+        <w:tblStyle w:val="Table"/>
+        <w:tblW w:type="pct" w:w="5000"/>
+        <w:jc w:val="left"/>
+        <w:tblLayout w:type="fixed"/>
+        <w:tblLook w:firstRow="1" w:lastRow="0" w:firstColumn="0" w:lastColumn="0" w:noHBand="0" w:noVBand="0" w:val="0020"/>
+        <w:tblBorders>
+          <w:top w:val="single" w:sz="4" w:color="C6D1D9"/>
+          <w:left w:val="single" w:sz="4" w:color="C6D1D9"/>
+          <w:bottom w:val="single" w:sz="4" w:color="C6D1D9"/>
+          <w:right w:val="single" w:sz="4" w:color="C6D1D9"/>
+          <w:insideH w:val="single" w:sz="4" w:color="C6D1D9"/>
+          <w:insideV w:val="single" w:sz="4" w:color="C6D1D9"/>
+        </w:tblBorders>
+      </w:tblPr>
+      <w:tblGrid>
+        <w:gridCol w:w="990"/>
+        <w:gridCol w:w="990"/>
+        <w:gridCol w:w="990"/>
+        <w:gridCol w:w="990"/>
+        <w:gridCol w:w="990"/>
+        <w:gridCol w:w="990"/>
+        <w:gridCol w:w="990"/>
+        <w:gridCol w:w="990"/>
+      </w:tblGrid>
+      <w:tr>
+        <w:trPr>
+          <w:tblHeader w:val="on"/>
+        </w:trPr>
+        <w:tc>
+          <w:tcPr>
+            <w:shd w:fill="DDE8EE"/>
+          </w:tcPr>
+          <w:p>
+            <w:pPr>
+              <w:pStyle w:val="Compact"/>
+              <w:jc w:val="left"/>
+            </w:pPr>
+            <w:r>
+              <w:rPr>
+                <w:sz w:val="16"/>
+              </w:rPr>
+              <w:t xml:space="preserve">年份</w:t>
+            </w:r>
+          </w:p>
+        </w:tc>
+        <w:tc>
+          <w:tcPr>
+            <w:shd w:fill="DDE8EE"/>
+          </w:tcPr>
+          <w:p>
+            <w:pPr>
+              <w:pStyle w:val="Compact"/>
+              <w:jc w:val="left"/>
+            </w:pPr>
+            <w:r>
+              <w:rPr>
+                <w:sz w:val="16"/>
+              </w:rPr>
+              <w:t xml:space="preserve">CC_R2</w:t>
+            </w:r>
+          </w:p>
+        </w:tc>
+        <w:tc>
+          <w:tcPr>
+            <w:shd w:fill="DDE8EE"/>
+          </w:tcPr>
+          <w:p>
+            <w:pPr>
+              <w:pStyle w:val="Compact"/>
+              <w:jc w:val="left"/>
+            </w:pPr>
+            <w:r>
+              <w:rPr>
+                <w:sz w:val="16"/>
+              </w:rPr>
+              <w:t xml:space="preserve">CC_RMSE</w:t>
+            </w:r>
+          </w:p>
+        </w:tc>
+        <w:tc>
+          <w:tcPr>
+            <w:shd w:fill="DDE8EE"/>
+          </w:tcPr>
+          <w:p>
+            <w:pPr>
+              <w:pStyle w:val="Compact"/>
+              <w:jc w:val="left"/>
+            </w:pPr>
+            <w:r>
+              <w:rPr>
+                <w:sz w:val="16"/>
+              </w:rPr>
+              <w:t xml:space="preserve">生物量_R2</w:t>
+            </w:r>
+          </w:p>
+        </w:tc>
+        <w:tc>
+          <w:tcPr>
+            <w:shd w:fill="DDE8EE"/>
+          </w:tcPr>
+          <w:p>
+            <w:pPr>
+              <w:pStyle w:val="Compact"/>
+              <w:jc w:val="left"/>
+            </w:pPr>
+            <w:r>
+              <w:rPr>
+                <w:sz w:val="16"/>
+              </w:rPr>
+              <w:t xml:space="preserve">生物量_RMSE</w:t>
+            </w:r>
+          </w:p>
+        </w:tc>
+        <w:tc>
+          <w:tcPr>
+            <w:shd w:fill="DDE8EE"/>
+          </w:tcPr>
+          <w:p>
+            <w:pPr>
+              <w:pStyle w:val="Compact"/>
+              <w:jc w:val="left"/>
+            </w:pPr>
+            <w:r>
+              <w:rPr>
+                <w:sz w:val="16"/>
+              </w:rPr>
+              <w:t xml:space="preserve">观测产量</w:t>
+            </w:r>
+          </w:p>
+        </w:tc>
+        <w:tc>
+          <w:tcPr>
+            <w:shd w:fill="DDE8EE"/>
+          </w:tcPr>
+          <w:p>
+            <w:pPr>
+              <w:pStyle w:val="Compact"/>
+              <w:jc w:val="left"/>
+            </w:pPr>
+            <w:r>
+              <w:rPr>
+                <w:sz w:val="16"/>
+              </w:rPr>
+              <w:t xml:space="preserve">模拟产量</w:t>
+            </w:r>
+          </w:p>
+        </w:tc>
+        <w:tc>
+          <w:tcPr>
+            <w:shd w:fill="DDE8EE"/>
+          </w:tcPr>
+          <w:p>
+            <w:pPr>
+              <w:pStyle w:val="Compact"/>
+              <w:jc w:val="left"/>
+            </w:pPr>
+            <w:r>
+              <w:rPr>
+                <w:sz w:val="16"/>
+              </w:rPr>
+              <w:t xml:space="preserve">产量误差_pct</w:t>
+            </w:r>
+          </w:p>
+        </w:tc>
+      </w:tr>
+      <w:tr>
+        <w:tc>
+          <w:tcPr/>
+          <w:p>
+            <w:pPr>
+              <w:pStyle w:val="Compact"/>
+              <w:jc w:val="left"/>
+            </w:pPr>
+            <w:r>
+              <w:rPr>
+                <w:sz w:val="16"/>
+              </w:rPr>
+              <w:t xml:space="preserve">2019</w:t>
+            </w:r>
+          </w:p>
+        </w:tc>
+        <w:tc>
+          <w:tcPr/>
+          <w:p>
+            <w:pPr>
+              <w:pStyle w:val="Compact"/>
+              <w:jc w:val="left"/>
+            </w:pPr>
+            <w:r>
+              <w:rPr>
+                <w:sz w:val="16"/>
+              </w:rPr>
+              <w:t xml:space="preserve">0.9932</w:t>
+            </w:r>
+          </w:p>
+        </w:tc>
+        <w:tc>
+          <w:tcPr/>
+          <w:p>
+            <w:pPr>
+              <w:pStyle w:val="Compact"/>
+              <w:jc w:val="left"/>
+            </w:pPr>
+            <w:r>
+              <w:rPr>
+                <w:sz w:val="16"/>
+              </w:rPr>
+              <w:t xml:space="preserve">0.0316</w:t>
+            </w:r>
+          </w:p>
+        </w:tc>
+        <w:tc>
+          <w:tcPr/>
+          <w:p>
+            <w:pPr>
+              <w:pStyle w:val="Compact"/>
+              <w:jc w:val="left"/>
+            </w:pPr>
+            <w:r>
+              <w:rPr>
+                <w:sz w:val="16"/>
+              </w:rPr>
+              <w:t xml:space="preserve">0.9926</w:t>
+            </w:r>
+          </w:p>
+        </w:tc>
+        <w:tc>
+          <w:tcPr/>
+          <w:p>
+            <w:pPr>
+              <w:pStyle w:val="Compact"/>
+              <w:jc w:val="left"/>
+            </w:pPr>
+            <w:r>
+              <w:rPr>
+                <w:sz w:val="16"/>
+              </w:rPr>
+              <w:t xml:space="preserve">1.0498</w:t>
+            </w:r>
+          </w:p>
+        </w:tc>
+        <w:tc>
+          <w:tcPr/>
+          <w:p>
+            <w:pPr>
+              <w:pStyle w:val="Compact"/>
+              <w:jc w:val="left"/>
+            </w:pPr>
+            <w:r>
+              <w:rPr>
+                <w:sz w:val="16"/>
+              </w:rPr>
+              <w:t xml:space="preserve">16.5500</w:t>
+            </w:r>
+          </w:p>
+        </w:tc>
+        <w:tc>
+          <w:tcPr/>
+          <w:p>
+            <w:pPr>
+              <w:pStyle w:val="Compact"/>
+              <w:jc w:val="left"/>
+            </w:pPr>
+            <w:r>
+              <w:rPr>
+                <w:sz w:val="16"/>
+              </w:rPr>
+              <w:t xml:space="preserve">16.7017</w:t>
+            </w:r>
+          </w:p>
+        </w:tc>
+        <w:tc>
+          <w:tcPr/>
+          <w:p>
+            <w:pPr>
+              <w:pStyle w:val="Compact"/>
+              <w:jc w:val="left"/>
+            </w:pPr>
+            <w:r>
+              <w:rPr>
+                <w:sz w:val="16"/>
+              </w:rPr>
+              <w:t xml:space="preserve">0.9166</w:t>
+            </w:r>
+          </w:p>
+        </w:tc>
+      </w:tr>
+      <w:tr>
+        <w:tc>
+          <w:tcPr/>
+          <w:p>
+            <w:pPr>
+              <w:pStyle w:val="Compact"/>
+              <w:jc w:val="left"/>
+            </w:pPr>
+            <w:r>
+              <w:rPr>
+                <w:sz w:val="16"/>
+              </w:rPr>
+              <w:t xml:space="preserve">2020</w:t>
+            </w:r>
+          </w:p>
+        </w:tc>
+        <w:tc>
+          <w:tcPr/>
+          <w:p>
+            <w:pPr>
+              <w:pStyle w:val="Compact"/>
+              <w:jc w:val="left"/>
+            </w:pPr>
+            <w:r>
+              <w:rPr>
+                <w:sz w:val="16"/>
+              </w:rPr>
+              <w:t xml:space="preserve">0.9794</w:t>
+            </w:r>
+          </w:p>
+        </w:tc>
+        <w:tc>
+          <w:tcPr/>
+          <w:p>
+            <w:pPr>
+              <w:pStyle w:val="Compact"/>
+              <w:jc w:val="left"/>
+            </w:pPr>
+            <w:r>
+              <w:rPr>
+                <w:sz w:val="16"/>
+              </w:rPr>
+              <w:t xml:space="preserve">0.0482</w:t>
+            </w:r>
+          </w:p>
+        </w:tc>
+        <w:tc>
+          <w:tcPr/>
+          <w:p>
+            <w:pPr>
+              <w:pStyle w:val="Compact"/>
+              <w:jc w:val="left"/>
+            </w:pPr>
+            <w:r>
+              <w:rPr>
+                <w:sz w:val="16"/>
+              </w:rPr>
+              <w:t xml:space="preserve">0.9766</w:t>
+            </w:r>
+          </w:p>
+        </w:tc>
+        <w:tc>
+          <w:tcPr/>
+          <w:p>
+            <w:pPr>
+              <w:pStyle w:val="Compact"/>
+              <w:jc w:val="left"/>
+            </w:pPr>
+            <w:r>
+              <w:rPr>
+                <w:sz w:val="16"/>
+              </w:rPr>
+              <w:t xml:space="preserve">1.1393</w:t>
+            </w:r>
+          </w:p>
+        </w:tc>
+        <w:tc>
+          <w:tcPr/>
+          <w:p>
+            <w:pPr>
+              <w:pStyle w:val="Compact"/>
+              <w:jc w:val="left"/>
+            </w:pPr>
+            <w:r>
+              <w:rPr>
+                <w:sz w:val="16"/>
+              </w:rPr>
+              <w:t xml:space="preserve">17.2900</w:t>
+            </w:r>
+          </w:p>
+        </w:tc>
+        <w:tc>
+          <w:tcPr/>
+          <w:p>
+            <w:pPr>
+              <w:pStyle w:val="Compact"/>
+              <w:jc w:val="left"/>
+            </w:pPr>
+            <w:r>
+              <w:rPr>
+                <w:sz w:val="16"/>
+              </w:rPr>
+              <w:t xml:space="preserve">16.8040</w:t>
+            </w:r>
+          </w:p>
+        </w:tc>
+        <w:tc>
+          <w:tcPr/>
+          <w:p>
+            <w:pPr>
+              <w:pStyle w:val="Compact"/>
+              <w:jc w:val="left"/>
+            </w:pPr>
+            <w:r>
+              <w:rPr>
+                <w:sz w:val="16"/>
+              </w:rPr>
+              <w:t xml:space="preserve">-2.8107</w:t>
+            </w:r>
+          </w:p>
+        </w:tc>
+      </w:tr>
+      <w:tr>
+        <w:tc>
+          <w:tcPr/>
+          <w:p>
+            <w:pPr>
+              <w:pStyle w:val="Compact"/>
+              <w:jc w:val="left"/>
+            </w:pPr>
+            <w:r>
+              <w:rPr>
+                <w:sz w:val="16"/>
+              </w:rPr>
+              <w:t xml:space="preserve">2021</w:t>
+            </w:r>
+          </w:p>
+        </w:tc>
+        <w:tc>
+          <w:tcPr/>
+          <w:p>
+            <w:pPr>
+              <w:pStyle w:val="Compact"/>
+              <w:jc w:val="left"/>
+            </w:pPr>
+            <w:r>
+              <w:rPr>
+                <w:sz w:val="16"/>
+              </w:rPr>
+              <w:t xml:space="preserve">0.9902</w:t>
+            </w:r>
+          </w:p>
+        </w:tc>
+        <w:tc>
+          <w:tcPr/>
+          <w:p>
+            <w:pPr>
+              <w:pStyle w:val="Compact"/>
+              <w:jc w:val="left"/>
+            </w:pPr>
+            <w:r>
+              <w:rPr>
+                <w:sz w:val="16"/>
+              </w:rPr>
+              <w:t xml:space="preserve">0.0370</w:t>
+            </w:r>
+          </w:p>
+        </w:tc>
+        <w:tc>
+          <w:tcPr/>
+          <w:p>
+            <w:pPr>
+              <w:pStyle w:val="Compact"/>
+              <w:jc w:val="left"/>
+            </w:pPr>
+            <w:r>
+              <w:rPr>
+                <w:sz w:val="16"/>
+              </w:rPr>
+              <w:t xml:space="preserve">0.9685</w:t>
+            </w:r>
+          </w:p>
+        </w:tc>
+        <w:tc>
+          <w:tcPr/>
+          <w:p>
+            <w:pPr>
+              <w:pStyle w:val="Compact"/>
+              <w:jc w:val="left"/>
+            </w:pPr>
+            <w:r>
+              <w:rPr>
+                <w:sz w:val="16"/>
+              </w:rPr>
+              <w:t xml:space="preserve">1.2520</w:t>
+            </w:r>
+          </w:p>
+        </w:tc>
+        <w:tc>
+          <w:tcPr/>
+          <w:p>
+            <w:pPr>
+              <w:pStyle w:val="Compact"/>
+              <w:jc w:val="left"/>
+            </w:pPr>
+            <w:r>
+              <w:rPr>
+                <w:sz w:val="16"/>
+              </w:rPr>
+              <w:t xml:space="preserve">15.8600</w:t>
+            </w:r>
+          </w:p>
+        </w:tc>
+        <w:tc>
+          <w:tcPr/>
+          <w:p>
+            <w:pPr>
+              <w:pStyle w:val="Compact"/>
+              <w:jc w:val="left"/>
+            </w:pPr>
+            <w:r>
+              <w:rPr>
+                <w:sz w:val="16"/>
+              </w:rPr>
+              <w:t xml:space="preserve">15.1971</w:t>
+            </w:r>
+          </w:p>
+        </w:tc>
+        <w:tc>
+          <w:tcPr/>
+          <w:p>
+            <w:pPr>
+              <w:pStyle w:val="Compact"/>
+              <w:jc w:val="left"/>
+            </w:pPr>
+            <w:r>
+              <w:rPr>
+                <w:sz w:val="16"/>
+              </w:rPr>
+              <w:t xml:space="preserve">-4.1795</w:t>
+            </w:r>
+          </w:p>
+        </w:tc>
+      </w:tr>
+      <w:tr>
+        <w:tc>
+          <w:tcPr/>
+          <w:p>
+            <w:pPr>
+              <w:pStyle w:val="Compact"/>
+              <w:jc w:val="left"/>
+            </w:pPr>
+            <w:r>
+              <w:rPr>
+                <w:sz w:val="16"/>
+              </w:rPr>
+              <w:t xml:space="preserve">2022</w:t>
+            </w:r>
+          </w:p>
+        </w:tc>
+        <w:tc>
+          <w:tcPr/>
+          <w:p>
+            <w:pPr>
+              <w:pStyle w:val="Compact"/>
+              <w:jc w:val="left"/>
+            </w:pPr>
+            <w:r>
+              <w:rPr>
+                <w:sz w:val="16"/>
+              </w:rPr>
+              <w:t xml:space="preserve">0.9310</w:t>
+            </w:r>
+          </w:p>
+        </w:tc>
+        <w:tc>
+          <w:tcPr/>
+          <w:p>
+            <w:pPr>
+              <w:pStyle w:val="Compact"/>
+              <w:jc w:val="left"/>
+            </w:pPr>
+            <w:r>
+              <w:rPr>
+                <w:sz w:val="16"/>
+              </w:rPr>
+              <w:t xml:space="preserve">0.0596</w:t>
+            </w:r>
+          </w:p>
+        </w:tc>
+        <w:tc>
+          <w:tcPr/>
+          <w:p>
+            <w:pPr>
+              <w:pStyle w:val="Compact"/>
+              <w:jc w:val="left"/>
+            </w:pPr>
+            <w:r>
+              <w:rPr>
+                <w:sz w:val="16"/>
+              </w:rPr>
+              <w:t xml:space="preserve">0.9970</w:t>
+            </w:r>
+          </w:p>
+        </w:tc>
+        <w:tc>
+          <w:tcPr/>
+          <w:p>
+            <w:pPr>
+              <w:pStyle w:val="Compact"/>
+              <w:jc w:val="left"/>
+            </w:pPr>
+            <w:r>
+              <w:rPr>
+                <w:sz w:val="16"/>
+              </w:rPr>
+              <w:t xml:space="preserve">0.5562</w:t>
+            </w:r>
+          </w:p>
+        </w:tc>
+        <w:tc>
+          <w:tcPr/>
+          <w:p>
+            <w:pPr>
+              <w:pStyle w:val="Compact"/>
+              <w:jc w:val="left"/>
+            </w:pPr>
+            <w:r>
+              <w:rPr>
+                <w:sz w:val="16"/>
+              </w:rPr>
+              <w:t xml:space="preserve">14.0800</w:t>
+            </w:r>
+          </w:p>
+        </w:tc>
+        <w:tc>
+          <w:tcPr/>
+          <w:p>
+            <w:pPr>
+              <w:pStyle w:val="Compact"/>
+              <w:jc w:val="left"/>
+            </w:pPr>
+            <w:r>
+              <w:rPr>
+                <w:sz w:val="16"/>
+              </w:rPr>
+              <w:t xml:space="preserve">14.0778</w:t>
+            </w:r>
+          </w:p>
+        </w:tc>
+        <w:tc>
+          <w:tcPr/>
+          <w:p>
+            <w:pPr>
+              <w:pStyle w:val="Compact"/>
+              <w:jc w:val="left"/>
+            </w:pPr>
+            <w:r>
+              <w:rPr>
+                <w:sz w:val="16"/>
+              </w:rPr>
+              <w:t xml:space="preserve">-0.0157</w:t>
+            </w:r>
+          </w:p>
+        </w:tc>
+      </w:tr>
+    </w:tbl>
+    <w:p>
+      <w:pPr>
+        <w:pStyle w:val="BodyText"/>
+      </w:pPr>
+      <w:r>
+        <w:t xml:space="preserve">2019—2021的配对评价沿用此前独立复算。2022 RMSE和产量现有精确JSON支持；R²=0.931/0.997仍为Word汇总值，缺少配对序列，不能声称本轮逐点重算。年产量每年一对，不计算单年产量相关系数。±5%是项目容许幅度，不是统计置信带。</w:t>
       </w:r>
     </w:p>
     <w:p>
@@ -1019,20 +1738,20 @@
       <w:r>
         <w:drawing>
           <wp:inline>
-            <wp:extent cx="5334000" cy="2385499"/>
+            <wp:extent cx="5334000" cy="2372440"/>
             <wp:effectExtent b="0" l="0" r="0" t="0"/>
-            <wp:docPr descr="年度参数范围" title="" id="41" name="Picture"/>
+            <wp:docPr descr="原链已补齐，配对序列证据仍需分别标注" title="" id="40" name="Picture"/>
             <a:graphic>
               <a:graphicData uri="http://schemas.openxmlformats.org/drawingml/2006/picture">
                 <pic:pic>
                   <pic:nvPicPr>
-                    <pic:cNvPr descr="figures/E01_annual_supports.png" id="42" name="Picture"/>
+                    <pic:cNvPr descr="figures/U04_calibration_scope.png" id="41" name="Picture"/>
                     <pic:cNvPicPr>
                       <a:picLocks noChangeArrowheads="1" noChangeAspect="1"/>
                     </pic:cNvPicPr>
                   </pic:nvPicPr>
                   <pic:blipFill>
-                    <a:blip r:embed="rId40"/>
+                    <a:blip r:embed="rId39"/>
                     <a:stretch>
                       <a:fillRect/>
                     </a:stretch>
@@ -1040,7 +1759,7 @@
                   <pic:spPr bwMode="auto">
                     <a:xfrm>
                       <a:off x="0" y="0"/>
-                      <a:ext cx="5334000" cy="2385499"/>
+                      <a:ext cx="5334000" cy="2372440"/>
                     </a:xfrm>
                     <a:prstGeom prst="rect">
                       <a:avLst/>
@@ -1064,7 +1783,7 @@
         <w:pStyle w:val="ImageCaption"/>
       </w:pPr>
       <w:r>
-        <w:t xml:space="preserve">年度参数范围</w:t>
+        <w:t xml:space="preserve">原链已补齐，配对序列证据仍需分别标注</w:t>
       </w:r>
     </w:p>
     <w:p>
@@ -1072,179 +1791,17 @@
         <w:pStyle w:val="BodyText"/>
       </w:pPr>
       <w:r>
-        <w:t xml:space="preserve">图注：前三年WP_early、WP_late均为10—40，HI0为0.35—0.60；2022分别为10—22、20—38、0.35—0.50。五个冠层/蒸腾参数支持范围一致。</w:t>
-      </w:r>
-    </w:p>
-    <w:p>
-      <w:pPr>
-        <w:pStyle w:val="BodyText"/>
-      </w:pPr>
-      <w:r>
-        <w:t xml:space="preserve">旧脚本把2022也放在前三年的较宽范围内，改变了该年输入方差与可行参数空间。新的年度范围设计忠实记录原始支持，但四年Sobol差异会同时受气象、模型年度设置和范围变化影响，不能直接归因为气候。</w:t>
-      </w:r>
-      <w:r>
-        <w:t xml:space="preserve"> </w:t>
-      </w:r>
-      <w:r>
-        <w:t xml:space="preserve">若研究重点是控制输入空间后的跨年比较，应另外预声明共同范围，例如四年支持的交集，并让四年都在该空间重新运行；不能只从不同范围的结果中做气候归因。当前仅生成年度范围设计，没有生成或运行共同范围模型响应。</w:t>
-      </w:r>
-      <w:r>
-        <w:t xml:space="preserve"> </w:t>
-      </w:r>
-      <w:r>
-        <w:t xml:space="preserve">原MCMC在部分参数上含正态先验成分，2022含正态成分的参数更多。独立均匀设计与这些原先验、条件后验均不同，不再使用“后验Sobol”或“校准吸收率”解释本设计。</w:t>
-      </w:r>
-    </w:p>
-    <w:bookmarkEnd w:id="43"/>
-    <w:bookmarkStart w:id="44" w:name="本轮已经生成的输入与尚未运行的响应"/>
+        <w:t xml:space="preserve">图注：2022空心R²仍为原Word中的汇总值，未从配对表重算；产量偏差与RMSE已更新为新JSON精确值。±5%为项目容许幅度。</w:t>
+      </w:r>
+    </w:p>
+    <w:bookmarkEnd w:id="42"/>
+    <w:bookmarkStart w:id="55" w:name="参数区间与补偿"/>
     <w:p>
       <w:pPr>
         <w:pStyle w:val="Heading3"/>
       </w:pPr>
       <w:r>
-        <w:t xml:space="preserve">4.2 本轮已经生成的输入与尚未运行的响应</w:t>
-      </w:r>
-    </w:p>
-    <w:p>
-      <w:pPr>
-        <w:pStyle w:val="FirstParagraph"/>
-      </w:pPr>
-      <w:r>
-        <w:t xml:space="preserve">四年各3个scramble种子101、202、303，N=128、D=8、不算二阶，共12组设计、15360行。每个块按A、AB_1至AB_8、B固定顺序保存NPY和带row_id的CSV；设计与配置均有SHA256。相同种子扩大到N=512时，现有N128是前缀，可复用已有成功响应，仍需核对软件版本与输入哈希。</w:t>
-      </w:r>
-      <w:r>
-        <w:t xml:space="preserve"> </w:t>
-      </w:r>
-      <w:r>
-        <w:t xml:space="preserve">real_model_pipeline.py提供设计生成、基准复现、逐点调用、断点续算和S1/ST分析。模板因缺真实模型而明确失败。常量输出标记为不可辨识的归一化指数，未赋予伪零排名；缺点、重复行、非有限响应和水量不闭合均阻止分析。bootstrap区间只是给定设计的抽样区间，不涵盖模型结构或田间误差。</w:t>
-      </w:r>
-      <w:r>
-        <w:t xml:space="preserve"> </w:t>
-      </w:r>
-      <w:r>
-        <w:t xml:space="preserve">程序用Ishigami解析函数及合成软件夹具测试；没有将这些测试输出写成玉米模型响应。真实Sobol响应矩阵仍未生成。</w:t>
-      </w:r>
-    </w:p>
-    <w:bookmarkEnd w:id="44"/>
-    <w:bookmarkEnd w:id="45"/>
-    <w:bookmarkStart w:id="51" w:name="确定性双目标nsga-iii的正式实施方案"/>
-    <w:p>
-      <w:pPr>
-        <w:pStyle w:val="Heading2"/>
-      </w:pPr>
-      <w:r>
-        <w:t xml:space="preserve">5 确定性双目标NSGA-III的正式实施方案</w:t>
-      </w:r>
-    </w:p>
-    <w:bookmarkStart w:id="46" w:name="管理变量"/>
-    <w:p>
-      <w:pPr>
-        <w:pStyle w:val="Heading3"/>
-      </w:pPr>
-      <w:r>
-        <w:t xml:space="preserve">5.1 管理变量</w:t>
-      </w:r>
-    </w:p>
-    <w:p>
-      <w:pPr>
-        <w:pStyle w:val="FirstParagraph"/>
-      </w:pPr>
-      <w:r>
-        <w:t xml:space="preserve">方案A为SMT1—SMT4，必须核对真实模块中百分比的定义、方向、根区和触发条件。方案B为四至五阶段水量、日期限定允许窗口。两者二选一；固定日期水量优化不写成日期优化。</w:t>
-      </w:r>
-      <w:r>
-        <w:t xml:space="preserve"> </w:t>
-      </w:r>
-      <w:r>
-        <w:t xml:space="preserve">### 5.2 目标与约束</w:t>
-      </w:r>
-      <w:r>
-        <w:t xml:space="preserve"> </w:t>
-      </w:r>
-      <w:r>
-        <w:t xml:space="preserve">固定年度中心参数，min(−Y13,I)。约束I≤年度DI模型基准；Y13≥0.95×文献观测产量；水量、灌期、非负量与守恒合格。同步报告相对同模型基准变化，防止混用观测、初始模拟与中心点模拟。</w:t>
-      </w:r>
-      <w:r>
-        <w:t xml:space="preserve"> </w:t>
-      </w:r>
-      <w:r>
-        <w:t xml:space="preserve">IWP=100×Y[t/ha]/I[mm]，单位kg/m³；产量统一13%含水率。零灌溉仅反事实，未经实测不得称验证情景。</w:t>
-      </w:r>
-      <w:r>
-        <w:t xml:space="preserve"> </w:t>
-      </w:r>
-      <w:r>
-        <w:t xml:space="preserve">### 5.3 预算、对照和选解</w:t>
-      </w:r>
-      <w:r>
-        <w:t xml:space="preserve"> </w:t>
-      </w:r>
-      <w:r>
-        <w:t xml:space="preserve">至少5种子、约100参考方向/种群、100代；双目标100个Das-Dennis方向可由99分割获得，不能照抄三目标配置。记录每代种群、目标和约束；加NSGA-II或参考方向敏感性对照。同年度同尺度使用固定HV参考点。</w:t>
-      </w:r>
-      <w:r>
-        <w:t xml:space="preserve"> </w:t>
-      </w:r>
-      <w:r>
-        <w:t xml:space="preserve">用ε约束选达产量阈值内最小水量，并列相邻备选；不自动称几何膝点。NSGA-III是算法名，不是只运行三代。约100×100×5×4=200000次候选调用，需先测实际耗时。</w:t>
-      </w:r>
-      <w:r>
-        <w:t xml:space="preserve"> </w:t>
-      </w:r>
-      <w:r>
-        <w:rPr>
-          <w:b/>
-          <w:bCs/>
-        </w:rPr>
-        <w:t xml:space="preserve">结果占位：真实前沿、最终节水率、推荐日程未生成。旧2021约38%已撤回；新文档2.28%等亦缺原始运行响应，本轮不纳入已核验结论。</w:t>
-      </w:r>
-    </w:p>
-    <w:bookmarkEnd w:id="46"/>
-    <w:bookmarkStart w:id="50" w:name="观测门槛与模型基准必须同时报告"/>
-    <w:p>
-      <w:pPr>
-        <w:pStyle w:val="Heading3"/>
-      </w:pPr>
-      <w:r>
-        <w:t xml:space="preserve">5.4 观测门槛与模型基准必须同时报告</w:t>
-      </w:r>
-    </w:p>
-    <w:p>
-      <w:pPr>
-        <w:pStyle w:val="FirstParagraph"/>
-      </w:pPr>
-      <w:r>
-        <w:t xml:space="preserve">基准模型对2020、2021观测产量已有负偏差。优化时Y≥0.95×观测不能替换为Y≥0.95×模型基准，否则会叠加减产。例如2021的观测15.86、模型基准15.1971，绝对门槛应为15.0670，而不是14.4373 t/ha。</w:t>
-      </w:r>
-      <w:r>
-        <w:t xml:space="preserve"> </w:t>
-      </w:r>
-      <w:r>
-        <w:t xml:space="preserve">| 年份 | 文献观测 | 模型基准 | 95%绝对门槛 | 可减产余量_pct |</w:t>
-      </w:r>
-      <w:r>
-        <w:t xml:space="preserve"> </w:t>
-      </w:r>
-      <w:r>
-        <w:t xml:space="preserve">| — | — | — | — | — |</w:t>
-      </w:r>
-      <w:r>
-        <w:t xml:space="preserve"> </w:t>
-      </w:r>
-      <w:r>
-        <w:t xml:space="preserve">| 2019 | 16.5500 | 16.7017 | 15.7225 | 5.8628 |</w:t>
-      </w:r>
-      <w:r>
-        <w:t xml:space="preserve"> </w:t>
-      </w:r>
-      <w:r>
-        <w:t xml:space="preserve">| 2020 | 17.2900 | 16.8040 | 16.4255 | 2.2527 |</w:t>
-      </w:r>
-      <w:r>
-        <w:t xml:space="preserve"> </w:t>
-      </w:r>
-      <w:r>
-        <w:t xml:space="preserve">| 2021 | 15.8600 | 15.1971 | 15.0670 | 0.8563 |</w:t>
+        <w:t xml:space="preserve">6.2 参数区间与补偿</w:t>
       </w:r>
     </w:p>
     <w:p>
@@ -1254,20 +1811,20 @@
       <w:r>
         <w:drawing>
           <wp:inline>
-            <wp:extent cx="5334000" cy="2637979"/>
+            <wp:extent cx="5334000" cy="3078651"/>
             <wp:effectExtent b="0" l="0" r="0" t="0"/>
-            <wp:docPr descr="保产余量" title="" id="48" name="Picture"/>
+            <wp:docPr descr="四年八参数区间：2022第二阶段已由真实链补齐" title="" id="44" name="Picture"/>
             <a:graphic>
               <a:graphicData uri="http://schemas.openxmlformats.org/drawingml/2006/picture">
                 <pic:pic>
                   <pic:nvPicPr>
-                    <pic:cNvPr descr="figures/E02_yield_gate_headroom.png" id="49" name="Picture"/>
+                    <pic:cNvPr descr="figures/F04_parameter_intervals.png" id="45" name="Picture"/>
                     <pic:cNvPicPr>
                       <a:picLocks noChangeArrowheads="1" noChangeAspect="1"/>
                     </pic:cNvPicPr>
                   </pic:nvPicPr>
                   <pic:blipFill>
-                    <a:blip r:embed="rId47"/>
+                    <a:blip r:embed="rId43"/>
                     <a:stretch>
                       <a:fillRect/>
                     </a:stretch>
@@ -1275,7 +1832,7 @@
                   <pic:spPr bwMode="auto">
                     <a:xfrm>
                       <a:off x="0" y="0"/>
-                      <a:ext cx="5334000" cy="2637979"/>
+                      <a:ext cx="5334000" cy="3078651"/>
                     </a:xfrm>
                     <a:prstGeom prst="rect">
                       <a:avLst/>
@@ -1299,7 +1856,7 @@
         <w:pStyle w:val="ImageCaption"/>
       </w:pPr>
       <w:r>
-        <w:t xml:space="preserve">保产余量</w:t>
+        <w:t xml:space="preserve">四年八参数区间：2022第二阶段已由真实链补齐</w:t>
       </w:r>
     </w:p>
     <w:p>
@@ -1307,107 +1864,7 @@
         <w:pStyle w:val="BodyText"/>
       </w:pPr>
       <w:r>
-        <w:t xml:space="preserve">图注：由2019—2021原始summary.json的DI和Yield字段计算；本轮未重跑真实模型。2021可减产余量约0.1301 t/ha、相对模型基准0.8563%。这只限定产量空间，不给出任何节水潜力结论，也不能据此推断该年一定没有可行节水方案。</w:t>
-      </w:r>
-      <w:r>
-        <w:t xml:space="preserve"> </w:t>
-      </w:r>
-      <w:r>
-        <w:t xml:space="preserve">新候选应同时报告相对观测和相对同模型基准的变化，保留绝对门槛、总灌水上限与逐日/季节水量守恒。2022中心点验收仍需原阶段二链和配套模拟输出，不使用报告中的汇总数充当已验收基准。</w:t>
-      </w:r>
-    </w:p>
-    <w:bookmarkEnd w:id="50"/>
-    <w:bookmarkEnd w:id="51"/>
-    <w:bookmarkStart w:id="52" w:name="条件扰动与适用范围"/>
-    <w:p>
-      <w:pPr>
-        <w:pStyle w:val="Heading2"/>
-      </w:pPr>
-      <w:r>
-        <w:t xml:space="preserve">6 条件扰动与适用范围</w:t>
-      </w:r>
-    </w:p>
-    <w:p>
-      <w:pPr>
-        <w:pStyle w:val="FirstParagraph"/>
-      </w:pPr>
-      <w:r>
-        <w:t xml:space="preserve">候选需真实模型回代。至少128组扰动是起始预算，仍要评估低分位和达标率的MC误差；样本数本身不保证可靠性。</w:t>
-      </w:r>
-      <w:r>
-        <w:t xml:space="preserve"> </w:t>
-      </w:r>
-      <w:r>
-        <w:t xml:space="preserve">分别扰动阶段一/固定阶段二中心，以及扰动阶段二整行样本/固定阶段一中心，保留组内相关。此为局部条件实验，不是完整联合传播。报告产量低分位、达标率、水量和守恒；这些概率只对应声明的条件分布，不是田间失收概率。</w:t>
-      </w:r>
-      <w:r>
-        <w:t xml:space="preserve"> </w:t>
-      </w:r>
-      <w:r>
-        <w:t xml:space="preserve">年度专用制度可逐年描述；推广到未知年份才需要留一年或嵌套跨年验证，不能用同四年既选制度又宣称外部验证。</w:t>
-      </w:r>
-    </w:p>
-    <w:bookmarkEnd w:id="52"/>
-    <w:bookmarkStart w:id="61" w:name="现阶段可写的结果"/>
-    <w:p>
-      <w:pPr>
-        <w:pStyle w:val="Heading2"/>
-      </w:pPr>
-      <w:r>
-        <w:t xml:space="preserve">7 现阶段可写的结果</w:t>
-      </w:r>
-    </w:p>
-    <w:bookmarkStart w:id="59" w:name="校准表现"/>
-    <w:p>
-      <w:pPr>
-        <w:pStyle w:val="Heading3"/>
-      </w:pPr>
-      <w:r>
-        <w:t xml:space="preserve">7.1 校准表现</w:t>
-      </w:r>
-    </w:p>
-    <w:p>
-      <w:pPr>
-        <w:pStyle w:val="FirstParagraph"/>
-      </w:pPr>
-      <w:r>
-        <w:t xml:space="preserve">2019—2021配对输出可复算；2022只列新文档汇总值，尚未得到本轮配对输出核验。校准误差和优化减产率是不同量。</w:t>
-      </w:r>
-      <w:r>
-        <w:t xml:space="preserve"> </w:t>
-      </w:r>
-      <w:r>
-        <w:t xml:space="preserve">| 年份 | CC样本数 | CC_R2 | CC_RMSE | 生物量样本数 | 生物量_R2 | 生物量_RMSE | 观测产量 | 模拟产量 | 产量误差_pct | 证据 |</w:t>
-      </w:r>
-      <w:r>
-        <w:t xml:space="preserve"> </w:t>
-      </w:r>
-      <w:r>
-        <w:t xml:space="preserve">| — | — | — | — | — | — | — | — | — | — | — |</w:t>
-      </w:r>
-      <w:r>
-        <w:t xml:space="preserve"> </w:t>
-      </w:r>
-      <w:r>
-        <w:t xml:space="preserve">| 2019 | 12 | 0.9932 | 0.0316 | 9.0000 | 0.9926 | 1.0498 | 16.5500 | 16.7017 | 0.9166 | 配对输出可复算 |</w:t>
-      </w:r>
-      <w:r>
-        <w:t xml:space="preserve"> </w:t>
-      </w:r>
-      <w:r>
-        <w:t xml:space="preserve">| 2020 | 13 | 0.9794 | 0.0482 | 10.0000 | 0.9766 | 1.1393 | 17.2900 | 16.8040 | -2.8107 | 配对输出可复算 |</w:t>
-      </w:r>
-      <w:r>
-        <w:t xml:space="preserve"> </w:t>
-      </w:r>
-      <w:r>
-        <w:t xml:space="preserve">| 2021 | 11 | 0.9902 | 0.0370 | 8.0000 | 0.9685 | 1.2520 | 15.8600 | 15.1971 | -4.1795 | 配对输出可复算 |</w:t>
-      </w:r>
-      <w:r>
-        <w:t xml:space="preserve"> </w:t>
-      </w:r>
-      <w:r>
-        <w:t xml:space="preserve">| 2022 | 12 | 0.9310 | 0.0600 | — | 0.9970 | 0.5560 | 14.0800 | 14.0800 | -0.0200 | 新文档汇总，缺配对输出 |</w:t>
+        <w:t xml:space="preserve">图注：点为中位数，线为2.5%—97.5%相关保留样本分位；灰短线为各年链支持。单组阶段二为条件分布，不是认证收敛或联合后验。</w:t>
       </w:r>
     </w:p>
     <w:p>
@@ -1417,20 +1874,20 @@
       <w:r>
         <w:drawing>
           <wp:inline>
-            <wp:extent cx="5334000" cy="2297589"/>
+            <wp:extent cx="5334000" cy="4857130"/>
             <wp:effectExtent b="0" l="0" r="0" t="0"/>
-            <wp:docPr descr="校准表现：按原始证据可复核程度分层" title="" id="54" name="Picture"/>
+            <wp:docPr descr="四年第二阶段：WP_late与HI0的参数补偿" title="" id="47" name="Picture"/>
             <a:graphic>
               <a:graphicData uri="http://schemas.openxmlformats.org/drawingml/2006/picture">
                 <pic:pic>
                   <pic:nvPicPr>
-                    <pic:cNvPr descr="figures/U04_calibration_scope.png" id="55" name="Picture"/>
+                    <pic:cNvPr descr="figures/F05_phase2_compensation.png" id="48" name="Picture"/>
                     <pic:cNvPicPr>
                       <a:picLocks noChangeArrowheads="1" noChangeAspect="1"/>
                     </pic:cNvPicPr>
                   </pic:nvPicPr>
                   <pic:blipFill>
-                    <a:blip r:embed="rId53"/>
+                    <a:blip r:embed="rId46"/>
                     <a:stretch>
                       <a:fillRect/>
                     </a:stretch>
@@ -1438,7 +1895,7 @@
                   <pic:spPr bwMode="auto">
                     <a:xfrm>
                       <a:off x="0" y="0"/>
-                      <a:ext cx="5334000" cy="2297589"/>
+                      <a:ext cx="5334000" cy="4857130"/>
                     </a:xfrm>
                     <a:prstGeom prst="rect">
                       <a:avLst/>
@@ -1462,7 +1919,7 @@
         <w:pStyle w:val="ImageCaption"/>
       </w:pPr>
       <w:r>
-        <w:t xml:space="preserve">校准表现：按原始证据可复核程度分层</w:t>
+        <w:t xml:space="preserve">四年第二阶段：WP_late与HI0的参数补偿</w:t>
       </w:r>
     </w:p>
     <w:p>
@@ -1470,7 +1927,21 @@
         <w:pStyle w:val="BodyText"/>
       </w:pPr>
       <w:r>
-        <w:t xml:space="preserve">图注：2019—2021配对结果沿用独立复算；2022空心/斜线为文档汇总值，缺阶段二配对输出。±5%是项目约定，不是统计置信区间。</w:t>
+        <w:t xml:space="preserve">图注：各图取同一年度真实阶段二的整行保留样本。2022相关系数约−0.645；阶段内相关已保留，不将不同阶段样本拼成八维联合后验。</w:t>
+      </w:r>
+    </w:p>
+    <w:p>
+      <w:pPr>
+        <w:pStyle w:val="BodyText"/>
+      </w:pPr>
+      <w:r>
+        <w:t xml:space="preserve">2022的WP_late—HI0相关约−0.645，说明阶段二组内仍有补偿结构。该关系来自同一行真实样本，不应通过边际独立重抽打散；也不能凭较窄区间证明因果识别或完整联合后验收敛。</w:t>
+      </w:r>
+      <w:r>
+        <w:t xml:space="preserve"> </w:t>
+      </w:r>
+      <w:r>
+        <w:t xml:space="preserve">### 6.3 新增真实链及水量账</w:t>
       </w:r>
     </w:p>
     <w:p>
@@ -1480,20 +1951,20 @@
       <w:r>
         <w:drawing>
           <wp:inline>
-            <wp:extent cx="5334000" cy="3228262"/>
+            <wp:extent cx="5334000" cy="4237247"/>
             <wp:effectExtent b="0" l="0" r="0" t="0"/>
-            <wp:docPr descr="2019—2021校准过程（沿用已核验图）" title="" id="57" name="Picture"/>
+            <wp:docPr descr="2022正式第二阶段链：预热段163步，保留1,837步/每walker" title="" id="50" name="Picture"/>
             <a:graphic>
               <a:graphicData uri="http://schemas.openxmlformats.org/drawingml/2006/picture">
                 <pic:pic>
                   <pic:nvPicPr>
-                    <pic:cNvPr descr="figures/U06_verified_calibration.png" id="58" name="Picture"/>
+                    <pic:cNvPr descr="figures/F15_2022_phase2_chain.png" id="51" name="Picture"/>
                     <pic:cNvPicPr>
                       <a:picLocks noChangeArrowheads="1" noChangeAspect="1"/>
                     </pic:cNvPicPr>
                   </pic:nvPicPr>
                   <pic:blipFill>
-                    <a:blip r:embed="rId56"/>
+                    <a:blip r:embed="rId49"/>
                     <a:stretch>
                       <a:fillRect/>
                     </a:stretch>
@@ -1501,7 +1972,7 @@
                   <pic:spPr bwMode="auto">
                     <a:xfrm>
                       <a:off x="0" y="0"/>
-                      <a:ext cx="5334000" cy="3228262"/>
+                      <a:ext cx="5334000" cy="4237247"/>
                     </a:xfrm>
                     <a:prstGeom prst="rect">
                       <a:avLst/>
@@ -1525,7 +1996,7 @@
         <w:pStyle w:val="ImageCaption"/>
       </w:pPr>
       <w:r>
-        <w:t xml:space="preserve">2019—2021校准过程（沿用已核验图）</w:t>
+        <w:t xml:space="preserve">2022正式第二阶段链：预热段163步，保留1,837步/每walker</w:t>
       </w:r>
     </w:p>
     <w:p>
@@ -1533,86 +2004,587 @@
         <w:pStyle w:val="BodyText"/>
       </w:pPr>
       <w:r>
-        <w:t xml:space="preserve">图注：据已有逐日输出和校准配对表；未重跑原模型，无新增外部验证。</w:t>
-      </w:r>
-    </w:p>
-    <w:bookmarkEnd w:id="59"/>
-    <w:bookmarkStart w:id="60" w:name="中心参数一致性"/>
-    <w:p>
-      <w:pPr>
-        <w:pStyle w:val="Heading3"/>
-      </w:pPr>
-      <w:r>
-        <w:t xml:space="preserve">7.2 中心参数一致性</w:t>
-      </w:r>
-    </w:p>
-    <w:p>
-      <w:pPr>
-        <w:pStyle w:val="FirstParagraph"/>
-      </w:pPr>
-      <w:r>
-        <w:t xml:space="preserve">29个中心值与原始保留均值一致。2022阶段二与实际源码仍缺原始可读文件。没有新证据证明所有参数严格多链收敛，应披露中心点近似的限制。</w:t>
-      </w:r>
-      <w:r>
-        <w:t xml:space="preserve"> </w:t>
-      </w:r>
-      <w:r>
-        <w:t xml:space="preserve">### 7.3 正式敏感性与管理结果</w:t>
-      </w:r>
-      <w:r>
-        <w:t xml:space="preserve"> </w:t>
-      </w:r>
-      <w:r>
-        <w:t xml:space="preserve">真实运行后再填：年度S1/ST/区间/输出方差，不同种子前沿与HV，基准和候选的产量/水量/IWP/储水变化，物理残差与ε约束方案、相邻备选、条件扰动。当前留空，不以旧代理数值顶替。</w:t>
-      </w:r>
-    </w:p>
-    <w:bookmarkEnd w:id="60"/>
-    <w:bookmarkEnd w:id="61"/>
-    <w:bookmarkStart w:id="62" w:name="讨论与结论"/>
-    <w:p>
-      <w:pPr>
-        <w:pStyle w:val="Heading2"/>
-      </w:pPr>
-      <w:r>
-        <w:t xml:space="preserve">8 讨论与结论</w:t>
-      </w:r>
-    </w:p>
-    <w:p>
-      <w:pPr>
-        <w:pStyle w:val="FirstParagraph"/>
-      </w:pPr>
-      <w:r>
-        <w:t xml:space="preserve">讨论应区分：校准拟合与识别性，独立范围响应与后验归因，确定性方案与高可靠性，以及年度专用与未知年推广。数据读图、灌溉日程、纠偏ETo和模型结构限制都应明示。</w:t>
-      </w:r>
-      <w:r>
-        <w:t xml:space="preserve"> </w:t>
-      </w:r>
-      <w:r>
-        <w:t xml:space="preserve">现阶段结论可写：</w:t>
-      </w:r>
-      <w:r>
-        <w:t xml:space="preserve">“</w:t>
-      </w:r>
-      <w:r>
-        <w:t xml:space="preserve">已形成分阶段条件校准的年度中心参数和可复现记录；独立范围Sobol及受约束确定性优化在逻辑上不依赖伪联合后验，正式数值仍待真实模型执行。</w:t>
-      </w:r>
-      <w:r>
-        <w:t xml:space="preserve">”</w:t>
-      </w:r>
-      <w:r>
-        <w:t xml:space="preserve">不提前写最终敏感参数、平均节水与推广结论。</w:t>
-      </w:r>
-    </w:p>
-    <w:bookmarkEnd w:id="62"/>
-    <w:bookmarkStart w:id="66" w:name="补充诊断与方法参考"/>
-    <w:p>
-      <w:pPr>
-        <w:pStyle w:val="Heading2"/>
-      </w:pPr>
-      <w:r>
-        <w:t xml:space="preserve">补充诊断与方法参考</w:t>
-      </w:r>
-    </w:p>
+        <w:t xml:space="preserve">图注：仅使用正式2000步检查点，2步smoke排除。5τ截断与τ长度参考不是独立多链收敛认证；未把32个walker当作32条独立链计算Rhat。</w:t>
+      </w:r>
+    </w:p>
+    <w:tbl>
+      <w:tblPr>
+        <w:tblStyle w:val="Table"/>
+        <w:tblW w:type="pct" w:w="5000"/>
+        <w:jc w:val="left"/>
+        <w:tblLayout w:type="fixed"/>
+        <w:tblLook w:firstRow="1" w:lastRow="0" w:firstColumn="0" w:lastColumn="0" w:noHBand="0" w:noVBand="0" w:val="0020"/>
+        <w:tblBorders>
+          <w:top w:val="single" w:sz="4" w:color="C6D1D9"/>
+          <w:left w:val="single" w:sz="4" w:color="C6D1D9"/>
+          <w:bottom w:val="single" w:sz="4" w:color="C6D1D9"/>
+          <w:right w:val="single" w:sz="4" w:color="C6D1D9"/>
+          <w:insideH w:val="single" w:sz="4" w:color="C6D1D9"/>
+          <w:insideV w:val="single" w:sz="4" w:color="C6D1D9"/>
+        </w:tblBorders>
+      </w:tblPr>
+      <w:tblGrid>
+        <w:gridCol w:w="1131"/>
+        <w:gridCol w:w="1131"/>
+        <w:gridCol w:w="1131"/>
+        <w:gridCol w:w="1131"/>
+        <w:gridCol w:w="1131"/>
+        <w:gridCol w:w="1131"/>
+        <w:gridCol w:w="1131"/>
+      </w:tblGrid>
+      <w:tr>
+        <w:trPr>
+          <w:tblHeader w:val="on"/>
+        </w:trPr>
+        <w:tc>
+          <w:tcPr>
+            <w:shd w:fill="DDE8EE"/>
+          </w:tcPr>
+          <w:p>
+            <w:pPr>
+              <w:pStyle w:val="Compact"/>
+              <w:jc w:val="left"/>
+            </w:pPr>
+            <w:r>
+              <w:rPr>
+                <w:sz w:val="16"/>
+              </w:rPr>
+              <w:t xml:space="preserve">年份</w:t>
+            </w:r>
+          </w:p>
+        </w:tc>
+        <w:tc>
+          <w:tcPr>
+            <w:shd w:fill="DDE8EE"/>
+          </w:tcPr>
+          <w:p>
+            <w:pPr>
+              <w:pStyle w:val="Compact"/>
+              <w:jc w:val="left"/>
+            </w:pPr>
+            <w:r>
+              <w:rPr>
+                <w:sz w:val="16"/>
+              </w:rPr>
+              <w:t xml:space="preserve">灌溉_mm</w:t>
+            </w:r>
+          </w:p>
+        </w:tc>
+        <w:tc>
+          <w:tcPr>
+            <w:shd w:fill="DDE8EE"/>
+          </w:tcPr>
+          <w:p>
+            <w:pPr>
+              <w:pStyle w:val="Compact"/>
+              <w:jc w:val="left"/>
+            </w:pPr>
+            <w:r>
+              <w:rPr>
+                <w:sz w:val="16"/>
+              </w:rPr>
+              <w:t xml:space="preserve">降水_mm</w:t>
+            </w:r>
+          </w:p>
+        </w:tc>
+        <w:tc>
+          <w:tcPr>
+            <w:shd w:fill="DDE8EE"/>
+          </w:tcPr>
+          <w:p>
+            <w:pPr>
+              <w:pStyle w:val="Compact"/>
+              <w:jc w:val="left"/>
+            </w:pPr>
+            <w:r>
+              <w:rPr>
+                <w:sz w:val="16"/>
+              </w:rPr>
+              <w:t xml:space="preserve">Tr_mm</w:t>
+            </w:r>
+          </w:p>
+        </w:tc>
+        <w:tc>
+          <w:tcPr>
+            <w:shd w:fill="DDE8EE"/>
+          </w:tcPr>
+          <w:p>
+            <w:pPr>
+              <w:pStyle w:val="Compact"/>
+              <w:jc w:val="left"/>
+            </w:pPr>
+            <w:r>
+              <w:rPr>
+                <w:sz w:val="16"/>
+              </w:rPr>
+              <w:t xml:space="preserve">Es_mm</w:t>
+            </w:r>
+          </w:p>
+        </w:tc>
+        <w:tc>
+          <w:tcPr>
+            <w:shd w:fill="DDE8EE"/>
+          </w:tcPr>
+          <w:p>
+            <w:pPr>
+              <w:pStyle w:val="Compact"/>
+              <w:jc w:val="left"/>
+            </w:pPr>
+            <w:r>
+              <w:rPr>
+                <w:sz w:val="16"/>
+              </w:rPr>
+              <w:t xml:space="preserve">ET_mm</w:t>
+            </w:r>
+          </w:p>
+        </w:tc>
+        <w:tc>
+          <w:tcPr>
+            <w:shd w:fill="DDE8EE"/>
+          </w:tcPr>
+          <w:p>
+            <w:pPr>
+              <w:pStyle w:val="Compact"/>
+              <w:jc w:val="left"/>
+            </w:pPr>
+            <w:r>
+              <w:rPr>
+                <w:sz w:val="16"/>
+              </w:rPr>
+              <w:t xml:space="preserve">储水增加_mm</w:t>
+            </w:r>
+          </w:p>
+        </w:tc>
+      </w:tr>
+      <w:tr>
+        <w:tc>
+          <w:tcPr/>
+          <w:p>
+            <w:pPr>
+              <w:pStyle w:val="Compact"/>
+              <w:jc w:val="left"/>
+            </w:pPr>
+            <w:r>
+              <w:rPr>
+                <w:sz w:val="16"/>
+              </w:rPr>
+              <w:t xml:space="preserve">2019</w:t>
+            </w:r>
+          </w:p>
+        </w:tc>
+        <w:tc>
+          <w:tcPr/>
+          <w:p>
+            <w:pPr>
+              <w:pStyle w:val="Compact"/>
+              <w:jc w:val="left"/>
+            </w:pPr>
+            <w:r>
+              <w:rPr>
+                <w:sz w:val="16"/>
+              </w:rPr>
+              <w:t xml:space="preserve">445.2700</w:t>
+            </w:r>
+          </w:p>
+        </w:tc>
+        <w:tc>
+          <w:tcPr/>
+          <w:p>
+            <w:pPr>
+              <w:pStyle w:val="Compact"/>
+              <w:jc w:val="left"/>
+            </w:pPr>
+            <w:r>
+              <w:rPr>
+                <w:sz w:val="16"/>
+              </w:rPr>
+              <w:t xml:space="preserve">177.8688</w:t>
+            </w:r>
+          </w:p>
+        </w:tc>
+        <w:tc>
+          <w:tcPr/>
+          <w:p>
+            <w:pPr>
+              <w:pStyle w:val="Compact"/>
+              <w:jc w:val="left"/>
+            </w:pPr>
+            <w:r>
+              <w:rPr>
+                <w:sz w:val="16"/>
+              </w:rPr>
+              <w:t xml:space="preserve">540.7645</w:t>
+            </w:r>
+          </w:p>
+        </w:tc>
+        <w:tc>
+          <w:tcPr/>
+          <w:p>
+            <w:pPr>
+              <w:pStyle w:val="Compact"/>
+              <w:jc w:val="left"/>
+            </w:pPr>
+            <w:r>
+              <w:rPr>
+                <w:sz w:val="16"/>
+              </w:rPr>
+              <w:t xml:space="preserve">97.2337</w:t>
+            </w:r>
+          </w:p>
+        </w:tc>
+        <w:tc>
+          <w:tcPr/>
+          <w:p>
+            <w:pPr>
+              <w:pStyle w:val="Compact"/>
+              <w:jc w:val="left"/>
+            </w:pPr>
+            <w:r>
+              <w:rPr>
+                <w:sz w:val="16"/>
+              </w:rPr>
+              <w:t xml:space="preserve">637.9982</w:t>
+            </w:r>
+          </w:p>
+        </w:tc>
+        <w:tc>
+          <w:tcPr/>
+          <w:p>
+            <w:pPr>
+              <w:pStyle w:val="Compact"/>
+              <w:jc w:val="left"/>
+            </w:pPr>
+            <w:r>
+              <w:rPr>
+                <w:sz w:val="16"/>
+              </w:rPr>
+              <w:t xml:space="preserve">-19.2272</w:t>
+            </w:r>
+          </w:p>
+        </w:tc>
+      </w:tr>
+      <w:tr>
+        <w:tc>
+          <w:tcPr/>
+          <w:p>
+            <w:pPr>
+              <w:pStyle w:val="Compact"/>
+              <w:jc w:val="left"/>
+            </w:pPr>
+            <w:r>
+              <w:rPr>
+                <w:sz w:val="16"/>
+              </w:rPr>
+              <w:t xml:space="preserve">2020</w:t>
+            </w:r>
+          </w:p>
+        </w:tc>
+        <w:tc>
+          <w:tcPr/>
+          <w:p>
+            <w:pPr>
+              <w:pStyle w:val="Compact"/>
+              <w:jc w:val="left"/>
+            </w:pPr>
+            <w:r>
+              <w:rPr>
+                <w:sz w:val="16"/>
+              </w:rPr>
+              <w:t xml:space="preserve">559.7600</w:t>
+            </w:r>
+          </w:p>
+        </w:tc>
+        <w:tc>
+          <w:tcPr/>
+          <w:p>
+            <w:pPr>
+              <w:pStyle w:val="Compact"/>
+              <w:jc w:val="left"/>
+            </w:pPr>
+            <w:r>
+              <w:rPr>
+                <w:sz w:val="16"/>
+              </w:rPr>
+              <w:t xml:space="preserve">113.4648</w:t>
+            </w:r>
+          </w:p>
+        </w:tc>
+        <w:tc>
+          <w:tcPr/>
+          <w:p>
+            <w:pPr>
+              <w:pStyle w:val="Compact"/>
+              <w:jc w:val="left"/>
+            </w:pPr>
+            <w:r>
+              <w:rPr>
+                <w:sz w:val="16"/>
+              </w:rPr>
+              <w:t xml:space="preserve">526.7431</w:t>
+            </w:r>
+          </w:p>
+        </w:tc>
+        <w:tc>
+          <w:tcPr/>
+          <w:p>
+            <w:pPr>
+              <w:pStyle w:val="Compact"/>
+              <w:jc w:val="left"/>
+            </w:pPr>
+            <w:r>
+              <w:rPr>
+                <w:sz w:val="16"/>
+              </w:rPr>
+              <w:t xml:space="preserve">83.2188</w:t>
+            </w:r>
+          </w:p>
+        </w:tc>
+        <w:tc>
+          <w:tcPr/>
+          <w:p>
+            <w:pPr>
+              <w:pStyle w:val="Compact"/>
+              <w:jc w:val="left"/>
+            </w:pPr>
+            <w:r>
+              <w:rPr>
+                <w:sz w:val="16"/>
+              </w:rPr>
+              <w:t xml:space="preserve">609.9619</w:t>
+            </w:r>
+          </w:p>
+        </w:tc>
+        <w:tc>
+          <w:tcPr/>
+          <w:p>
+            <w:pPr>
+              <w:pStyle w:val="Compact"/>
+              <w:jc w:val="left"/>
+            </w:pPr>
+            <w:r>
+              <w:rPr>
+                <w:sz w:val="16"/>
+              </w:rPr>
+              <w:t xml:space="preserve">61.9190</w:t>
+            </w:r>
+          </w:p>
+        </w:tc>
+      </w:tr>
+      <w:tr>
+        <w:tc>
+          <w:tcPr/>
+          <w:p>
+            <w:pPr>
+              <w:pStyle w:val="Compact"/>
+              <w:jc w:val="left"/>
+            </w:pPr>
+            <w:r>
+              <w:rPr>
+                <w:sz w:val="16"/>
+              </w:rPr>
+              <w:t xml:space="preserve">2021</w:t>
+            </w:r>
+          </w:p>
+        </w:tc>
+        <w:tc>
+          <w:tcPr/>
+          <w:p>
+            <w:pPr>
+              <w:pStyle w:val="Compact"/>
+              <w:jc w:val="left"/>
+            </w:pPr>
+            <w:r>
+              <w:rPr>
+                <w:sz w:val="16"/>
+              </w:rPr>
+              <w:t xml:space="preserve">633.4700</w:t>
+            </w:r>
+          </w:p>
+        </w:tc>
+        <w:tc>
+          <w:tcPr/>
+          <w:p>
+            <w:pPr>
+              <w:pStyle w:val="Compact"/>
+              <w:jc w:val="left"/>
+            </w:pPr>
+            <w:r>
+              <w:rPr>
+                <w:sz w:val="16"/>
+              </w:rPr>
+              <w:t xml:space="preserve">143.3228</w:t>
+            </w:r>
+          </w:p>
+        </w:tc>
+        <w:tc>
+          <w:tcPr/>
+          <w:p>
+            <w:pPr>
+              <w:pStyle w:val="Compact"/>
+              <w:jc w:val="left"/>
+            </w:pPr>
+            <w:r>
+              <w:rPr>
+                <w:sz w:val="16"/>
+              </w:rPr>
+              <w:t xml:space="preserve">533.2378</w:t>
+            </w:r>
+          </w:p>
+        </w:tc>
+        <w:tc>
+          <w:tcPr/>
+          <w:p>
+            <w:pPr>
+              <w:pStyle w:val="Compact"/>
+              <w:jc w:val="left"/>
+            </w:pPr>
+            <w:r>
+              <w:rPr>
+                <w:sz w:val="16"/>
+              </w:rPr>
+              <w:t xml:space="preserve">71.9055</w:t>
+            </w:r>
+          </w:p>
+        </w:tc>
+        <w:tc>
+          <w:tcPr/>
+          <w:p>
+            <w:pPr>
+              <w:pStyle w:val="Compact"/>
+              <w:jc w:val="left"/>
+            </w:pPr>
+            <w:r>
+              <w:rPr>
+                <w:sz w:val="16"/>
+              </w:rPr>
+              <w:t xml:space="preserve">605.1434</w:t>
+            </w:r>
+          </w:p>
+        </w:tc>
+        <w:tc>
+          <w:tcPr/>
+          <w:p>
+            <w:pPr>
+              <w:pStyle w:val="Compact"/>
+              <w:jc w:val="left"/>
+            </w:pPr>
+            <w:r>
+              <w:rPr>
+                <w:sz w:val="16"/>
+              </w:rPr>
+              <w:t xml:space="preserve">169.9674</w:t>
+            </w:r>
+          </w:p>
+        </w:tc>
+      </w:tr>
+      <w:tr>
+        <w:tc>
+          <w:tcPr/>
+          <w:p>
+            <w:pPr>
+              <w:pStyle w:val="Compact"/>
+              <w:jc w:val="left"/>
+            </w:pPr>
+            <w:r>
+              <w:rPr>
+                <w:sz w:val="16"/>
+              </w:rPr>
+              <w:t xml:space="preserve">2022</w:t>
+            </w:r>
+          </w:p>
+        </w:tc>
+        <w:tc>
+          <w:tcPr/>
+          <w:p>
+            <w:pPr>
+              <w:pStyle w:val="Compact"/>
+              <w:jc w:val="left"/>
+            </w:pPr>
+            <w:r>
+              <w:rPr>
+                <w:sz w:val="16"/>
+              </w:rPr>
+              <w:t xml:space="preserve">404.8400</w:t>
+            </w:r>
+          </w:p>
+        </w:tc>
+        <w:tc>
+          <w:tcPr/>
+          <w:p>
+            <w:pPr>
+              <w:pStyle w:val="Compact"/>
+              <w:jc w:val="left"/>
+            </w:pPr>
+            <w:r>
+              <w:rPr>
+                <w:sz w:val="16"/>
+              </w:rPr>
+              <w:t xml:space="preserve">151.3838</w:t>
+            </w:r>
+          </w:p>
+        </w:tc>
+        <w:tc>
+          <w:tcPr/>
+          <w:p>
+            <w:pPr>
+              <w:pStyle w:val="Compact"/>
+              <w:jc w:val="left"/>
+            </w:pPr>
+            <w:r>
+              <w:rPr>
+                <w:sz w:val="16"/>
+              </w:rPr>
+              <w:t xml:space="preserve">529.9393</w:t>
+            </w:r>
+          </w:p>
+        </w:tc>
+        <w:tc>
+          <w:tcPr/>
+          <w:p>
+            <w:pPr>
+              <w:pStyle w:val="Compact"/>
+              <w:jc w:val="left"/>
+            </w:pPr>
+            <w:r>
+              <w:rPr>
+                <w:sz w:val="16"/>
+              </w:rPr>
+              <w:t xml:space="preserve">66.8453</w:t>
+            </w:r>
+          </w:p>
+        </w:tc>
+        <w:tc>
+          <w:tcPr/>
+          <w:p>
+            <w:pPr>
+              <w:pStyle w:val="Compact"/>
+              <w:jc w:val="left"/>
+            </w:pPr>
+            <w:r>
+              <w:rPr>
+                <w:sz w:val="16"/>
+              </w:rPr>
+              <w:t xml:space="preserve">596.7846</w:t>
+            </w:r>
+          </w:p>
+        </w:tc>
+        <w:tc>
+          <w:tcPr/>
+          <w:p>
+            <w:pPr>
+              <w:pStyle w:val="Compact"/>
+              <w:jc w:val="left"/>
+            </w:pPr>
+            <w:r>
+              <w:rPr>
+                <w:sz w:val="16"/>
+              </w:rPr>
+              <w:t xml:space="preserve">-40.5824</w:t>
+            </w:r>
+          </w:p>
+        </w:tc>
+      </w:tr>
+    </w:tbl>
     <w:p>
       <w:pPr>
         <w:pStyle w:val="CaptionedFigure"/>
@@ -1620,20 +2592,20 @@
       <w:r>
         <w:drawing>
           <wp:inline>
-            <wp:extent cx="5334000" cy="3342094"/>
+            <wp:extent cx="5334000" cy="2424677"/>
             <wp:effectExtent b="0" l="0" r="0" t="0"/>
-            <wp:docPr descr="补充诊断：第一阶段跨独立ensemble的Rhat" title="" id="64" name="Picture"/>
+            <wp:docPr descr="四年原模型季节水量账与历史代理缺口分开报告" title="" id="53" name="Picture"/>
             <a:graphic>
               <a:graphicData uri="http://schemas.openxmlformats.org/drawingml/2006/picture">
                 <pic:pic>
                   <pic:nvPicPr>
-                    <pic:cNvPr descr="figures/SF01_rhat_disclosure.png" id="65" name="Picture"/>
+                    <pic:cNvPr descr="figures/F06_water_ledger.png" id="54" name="Picture"/>
                     <pic:cNvPicPr>
                       <a:picLocks noChangeArrowheads="1" noChangeAspect="1"/>
                     </pic:cNvPicPr>
                   </pic:nvPicPr>
                   <pic:blipFill>
-                    <a:blip r:embed="rId63"/>
+                    <a:blip r:embed="rId52"/>
                     <a:stretch>
                       <a:fillRect/>
                     </a:stretch>
@@ -1641,7 +2613,7 @@
                   <pic:spPr bwMode="auto">
                     <a:xfrm>
                       <a:off x="0" y="0"/>
-                      <a:ext cx="5334000" cy="3342094"/>
+                      <a:ext cx="5334000" cy="2424677"/>
                     </a:xfrm>
                     <a:prstGeom prst="rect">
                       <a:avLst/>
@@ -1665,7 +2637,7 @@
         <w:pStyle w:val="ImageCaption"/>
       </w:pPr>
       <w:r>
-        <w:t xml:space="preserve">补充诊断：第一阶段跨独立ensemble的Rhat</w:t>
+        <w:t xml:space="preserve">四年原模型季节水量账与历史代理缺口分开报告</w:t>
       </w:r>
     </w:p>
     <w:p>
@@ -1673,7 +2645,7 @@
         <w:pStyle w:val="BodyText"/>
       </w:pPr>
       <w:r>
-        <w:t xml:space="preserve">图注：匹配walker索引跨4个独立ensemble分别计算，报告最大值。限定为中心点确定性研究不等于已证明严格后验收敛。</w:t>
+        <w:t xml:space="preserve">图注：2022由新增conditional_mean_model.json核算：储水消耗40.58mm，残差约10^-12mm；不代表已重新运行原模型。右侧历史代理数值未重跑。</w:t>
       </w:r>
     </w:p>
     <w:p>
@@ -1681,17 +2653,72 @@
         <w:pStyle w:val="BodyText"/>
       </w:pPr>
       <w:r>
-        <w:t xml:space="preserve">可核对FAO Irrigation and Drainage Paper 66；Goodman &amp; Weare (2010), DOI 10.2140/camcos.2010.5.65；Vehtari et al. (2021), DOI 10.1214/20-BA1221；Saltelli et al. (2010), DOI 10.1016/j.cpc.2009.09.018；Deb &amp; Jain (2014), DOI 10.1109/TEVC.2013.2281535。</w:t>
-      </w:r>
-      <w:r>
-        <w:t xml:space="preserve"> </w:t>
-      </w:r>
-      <w:r>
-        <w:t xml:space="preserve">本次具体参照论文仅有Windows路径和哈希，没有PDF原文，正式引用与设置仍待核。</w:t>
-      </w:r>
-    </w:p>
-    <w:bookmarkEnd w:id="66"/>
-    <w:bookmarkEnd w:id="67"/>
+        <w:t xml:space="preserve">四年季节水量残差约10^-12mm是内部守恒证据，不替代真实通量验证。2021储水增加约169.97mm；2022消耗40.58mm。2022零灌溉给出的约58.45%减产仍为未验证反事实。</w:t>
+      </w:r>
+      <w:r>
+        <w:t xml:space="preserve"> </w:t>
+      </w:r>
+      <w:r>
+        <w:t xml:space="preserve">### 6.4 待真实模型填入的敏感性与管理结果</w:t>
+      </w:r>
+      <w:r>
+        <w:t xml:space="preserve"> </w:t>
+      </w:r>
+      <w:r>
+        <w:t xml:space="preserve">填写年度S1/ST与区间、输出方差、不同种子前沿和HV、算法对照、基准/候选产量及水量/IWP/储水变化、ε备选、条件概率与低分位。历史代理结果只在审计附录中注明版本和局限，不替代本节。</w:t>
+      </w:r>
+    </w:p>
+    <w:bookmarkEnd w:id="55"/>
+    <w:bookmarkEnd w:id="56"/>
+    <w:bookmarkStart w:id="57" w:name="讨论限制与结论边界"/>
+    <w:p>
+      <w:pPr>
+        <w:pStyle w:val="Heading2"/>
+      </w:pPr>
+      <w:r>
+        <w:t xml:space="preserve">7 讨论、限制与结论边界</w:t>
+      </w:r>
+    </w:p>
+    <w:p>
+      <w:pPr>
+        <w:pStyle w:val="FirstParagraph"/>
+      </w:pPr>
+      <w:r>
+        <w:t xml:space="preserve">讨论应区分样本内校准与外部验证、公共独立范围响应与后验归因、确定性最优与可靠性，以及年度专用与未知年推广。数字化资料、部分假定灌溉、近似Es、纠偏ETo和模型结构误差应透明披露。</w:t>
+      </w:r>
+      <w:r>
+        <w:t xml:space="preserve"> </w:t>
+      </w:r>
+      <w:r>
+        <w:t xml:space="preserve">本轮可得结论是：四年分阶段原链和年度中心输入已具备完整的可追溯记录；2022条件分布与均值点量账得到交叉核验。正式敏感性和受约束灌溉优化在研究逻辑上不需要虚构八维联合后验，但最终数值仍须真实Modified DI执行。</w:t>
+      </w:r>
+    </w:p>
+    <w:bookmarkEnd w:id="57"/>
+    <w:bookmarkStart w:id="58" w:name="补充材料与方法参考"/>
+    <w:p>
+      <w:pPr>
+        <w:pStyle w:val="Heading2"/>
+      </w:pPr>
+      <w:r>
+        <w:t xml:space="preserve">补充材料与方法参考</w:t>
+      </w:r>
+    </w:p>
+    <w:p>
+      <w:pPr>
+        <w:pStyle w:val="FirstParagraph"/>
+      </w:pPr>
+      <w:r>
+        <w:t xml:space="preserve">提交原始/保留数组形状、20组检查点哈希、2022核验记录、参数区间与阶段内相关、严格阶段一诊断、输入空间与执行状态、软件测试及历史代理说明。原模型缺件与参考PDF未提供分别说明，不把软件测试当作作物验证。</w:t>
+      </w:r>
+      <w:r>
+        <w:t xml:space="preserve"> </w:t>
+      </w:r>
+      <w:r>
+        <w:t xml:space="preserve">参考方向可核对FAO Irrigation and Drainage Paper 66；Goodman与Weare（2010），DOI 10.2140/camcos.2010.5.65；Vehtari等（2021），DOI 10.1214/20-BA1221；Saltelli等（2010），DOI 10.1016/j.cpc.2009.09.018；Deb与Jain（2014），DOI 10.1109/TEVC.2013.2281535。用户参照论文目前仅有路径和哈希，具体原文引用仍待核。</w:t>
+      </w:r>
+    </w:p>
+    <w:bookmarkEnd w:id="58"/>
+    <w:bookmarkEnd w:id="59"/>
     <w:sectPr>
       <w:footerReference w:type="default" r:id="rId9"/>
       <w:pgSz w:w="11906" w:h="16838"/>

</xml_diff>